<commit_message>
More work on user guide
Former-commit-id: cb101395a19a573ba56099d9e9345e99dd770449
Former-commit-id: 39debabb20b1d7f145e9efb6bdf19eeab9466123
</commit_message>
<xml_diff>
--- a/Manual/RapidSE USer Guide v4.0 rev03.docx
+++ b/Manual/RapidSE USer Guide v4.0 rev03.docx
@@ -222,8 +222,11 @@
       <w:r>
         <w:rPr>
           <w:rStyle w:val="IntenseEmphasis"/>
+          <w:b w:val="0"/>
+          <w:bCs w:val="0"/>
           <w:i w:val="0"/>
           <w:iCs w:val="0"/>
+          <w:caps w:val="0"/>
           <w:color w:val="2F5496" w:themeColor="accent1" w:themeShade="BF"/>
         </w:rPr>
         <w:lastRenderedPageBreak/>
@@ -232,8 +235,11 @@
       <w:r>
         <w:rPr>
           <w:rStyle w:val="IntenseEmphasis"/>
+          <w:b w:val="0"/>
+          <w:bCs w:val="0"/>
           <w:i w:val="0"/>
           <w:iCs w:val="0"/>
+          <w:caps w:val="0"/>
           <w:color w:val="2F5496" w:themeColor="accent1" w:themeShade="BF"/>
         </w:rPr>
         <w:instrText xml:space="preserve"> TOC \o "1-2" \h \z \u </w:instrText>
@@ -241,13 +247,16 @@
       <w:r>
         <w:rPr>
           <w:rStyle w:val="IntenseEmphasis"/>
+          <w:b w:val="0"/>
+          <w:bCs w:val="0"/>
           <w:i w:val="0"/>
           <w:iCs w:val="0"/>
+          <w:caps w:val="0"/>
           <w:color w:val="2F5496" w:themeColor="accent1" w:themeShade="BF"/>
         </w:rPr>
         <w:fldChar w:fldCharType="separate"/>
       </w:r>
-      <w:hyperlink w:anchor="_Toc612395" w:history="1">
+      <w:hyperlink w:anchor="_Toc614912" w:history="1">
         <w:r>
           <w:rPr>
             <w:rStyle w:val="Hyperlink"/>
@@ -274,7 +283,7 @@
             <w:noProof/>
             <w:webHidden/>
           </w:rPr>
-          <w:instrText xml:space="preserve"> PAGEREF _Toc612395 \h </w:instrText>
+          <w:instrText xml:space="preserve"> PAGEREF _Toc614912 \h </w:instrText>
         </w:r>
         <w:r>
           <w:rPr>
@@ -321,7 +330,7 @@
           <w:szCs w:val="24"/>
         </w:rPr>
       </w:pPr>
-      <w:hyperlink w:anchor="_Toc612396" w:history="1">
+      <w:hyperlink w:anchor="_Toc614913" w:history="1">
         <w:r>
           <w:rPr>
             <w:rStyle w:val="Hyperlink"/>
@@ -348,7 +357,7 @@
             <w:noProof/>
             <w:webHidden/>
           </w:rPr>
-          <w:instrText xml:space="preserve"> PAGEREF _Toc612396 \h </w:instrText>
+          <w:instrText xml:space="preserve"> PAGEREF _Toc614913 \h </w:instrText>
         </w:r>
         <w:r>
           <w:rPr>
@@ -393,7 +402,7 @@
           <w:szCs w:val="24"/>
         </w:rPr>
       </w:pPr>
-      <w:hyperlink w:anchor="_Toc612397" w:history="1">
+      <w:hyperlink w:anchor="_Toc614914" w:history="1">
         <w:r>
           <w:rPr>
             <w:rStyle w:val="Hyperlink"/>
@@ -420,7 +429,7 @@
             <w:noProof/>
             <w:webHidden/>
           </w:rPr>
-          <w:instrText xml:space="preserve"> PAGEREF _Toc612397 \h </w:instrText>
+          <w:instrText xml:space="preserve"> PAGEREF _Toc614914 \h </w:instrText>
         </w:r>
         <w:r>
           <w:rPr>
@@ -465,7 +474,7 @@
           <w:szCs w:val="24"/>
         </w:rPr>
       </w:pPr>
-      <w:hyperlink w:anchor="_Toc612398" w:history="1">
+      <w:hyperlink w:anchor="_Toc614915" w:history="1">
         <w:r>
           <w:rPr>
             <w:rStyle w:val="Hyperlink"/>
@@ -492,7 +501,7 @@
             <w:noProof/>
             <w:webHidden/>
           </w:rPr>
-          <w:instrText xml:space="preserve"> PAGEREF _Toc612398 \h </w:instrText>
+          <w:instrText xml:space="preserve"> PAGEREF _Toc614915 \h </w:instrText>
         </w:r>
         <w:r>
           <w:rPr>
@@ -537,7 +546,7 @@
           <w:szCs w:val="24"/>
         </w:rPr>
       </w:pPr>
-      <w:hyperlink w:anchor="_Toc612399" w:history="1">
+      <w:hyperlink w:anchor="_Toc614916" w:history="1">
         <w:r>
           <w:rPr>
             <w:rStyle w:val="Hyperlink"/>
@@ -564,7 +573,7 @@
             <w:noProof/>
             <w:webHidden/>
           </w:rPr>
-          <w:instrText xml:space="preserve"> PAGEREF _Toc612399 \h </w:instrText>
+          <w:instrText xml:space="preserve"> PAGEREF _Toc614916 \h </w:instrText>
         </w:r>
         <w:r>
           <w:rPr>
@@ -609,7 +618,7 @@
           <w:szCs w:val="24"/>
         </w:rPr>
       </w:pPr>
-      <w:hyperlink w:anchor="_Toc612400" w:history="1">
+      <w:hyperlink w:anchor="_Toc614917" w:history="1">
         <w:r>
           <w:rPr>
             <w:rStyle w:val="Hyperlink"/>
@@ -636,7 +645,7 @@
             <w:noProof/>
             <w:webHidden/>
           </w:rPr>
-          <w:instrText xml:space="preserve"> PAGEREF _Toc612400 \h </w:instrText>
+          <w:instrText xml:space="preserve"> PAGEREF _Toc614917 \h </w:instrText>
         </w:r>
         <w:r>
           <w:rPr>
@@ -681,7 +690,7 @@
           <w:szCs w:val="24"/>
         </w:rPr>
       </w:pPr>
-      <w:hyperlink w:anchor="_Toc612401" w:history="1">
+      <w:hyperlink w:anchor="_Toc614918" w:history="1">
         <w:r>
           <w:rPr>
             <w:rStyle w:val="Hyperlink"/>
@@ -708,7 +717,7 @@
             <w:noProof/>
             <w:webHidden/>
           </w:rPr>
-          <w:instrText xml:space="preserve"> PAGEREF _Toc612401 \h </w:instrText>
+          <w:instrText xml:space="preserve"> PAGEREF _Toc614918 \h </w:instrText>
         </w:r>
         <w:r>
           <w:rPr>
@@ -728,7 +737,7 @@
             <w:noProof/>
             <w:webHidden/>
           </w:rPr>
-          <w:t>3</w:t>
+          <w:t>4</w:t>
         </w:r>
         <w:r>
           <w:rPr>
@@ -755,7 +764,7 @@
           <w:szCs w:val="24"/>
         </w:rPr>
       </w:pPr>
-      <w:hyperlink w:anchor="_Toc612402" w:history="1">
+      <w:hyperlink w:anchor="_Toc614919" w:history="1">
         <w:r>
           <w:rPr>
             <w:rStyle w:val="Hyperlink"/>
@@ -782,7 +791,7 @@
             <w:noProof/>
             <w:webHidden/>
           </w:rPr>
-          <w:instrText xml:space="preserve"> PAGEREF _Toc612402 \h </w:instrText>
+          <w:instrText xml:space="preserve"> PAGEREF _Toc614919 \h </w:instrText>
         </w:r>
         <w:r>
           <w:rPr>
@@ -827,7 +836,7 @@
           <w:szCs w:val="24"/>
         </w:rPr>
       </w:pPr>
-      <w:hyperlink w:anchor="_Toc612403" w:history="1">
+      <w:hyperlink w:anchor="_Toc614920" w:history="1">
         <w:r>
           <w:rPr>
             <w:rStyle w:val="Hyperlink"/>
@@ -854,7 +863,7 @@
             <w:noProof/>
             <w:webHidden/>
           </w:rPr>
-          <w:instrText xml:space="preserve"> PAGEREF _Toc612403 \h </w:instrText>
+          <w:instrText xml:space="preserve"> PAGEREF _Toc614920 \h </w:instrText>
         </w:r>
         <w:r>
           <w:rPr>
@@ -899,7 +908,7 @@
           <w:szCs w:val="24"/>
         </w:rPr>
       </w:pPr>
-      <w:hyperlink w:anchor="_Toc612404" w:history="1">
+      <w:hyperlink w:anchor="_Toc614921" w:history="1">
         <w:r>
           <w:rPr>
             <w:rStyle w:val="Hyperlink"/>
@@ -926,7 +935,7 @@
             <w:noProof/>
             <w:webHidden/>
           </w:rPr>
-          <w:instrText xml:space="preserve"> PAGEREF _Toc612404 \h </w:instrText>
+          <w:instrText xml:space="preserve"> PAGEREF _Toc614921 \h </w:instrText>
         </w:r>
         <w:r>
           <w:rPr>
@@ -971,7 +980,7 @@
           <w:szCs w:val="24"/>
         </w:rPr>
       </w:pPr>
-      <w:hyperlink w:anchor="_Toc612405" w:history="1">
+      <w:hyperlink w:anchor="_Toc614922" w:history="1">
         <w:r>
           <w:rPr>
             <w:rStyle w:val="Hyperlink"/>
@@ -998,7 +1007,7 @@
             <w:noProof/>
             <w:webHidden/>
           </w:rPr>
-          <w:instrText xml:space="preserve"> PAGEREF _Toc612405 \h </w:instrText>
+          <w:instrText xml:space="preserve"> PAGEREF _Toc614922 \h </w:instrText>
         </w:r>
         <w:r>
           <w:rPr>
@@ -1043,7 +1052,7 @@
           <w:szCs w:val="24"/>
         </w:rPr>
       </w:pPr>
-      <w:hyperlink w:anchor="_Toc612406" w:history="1">
+      <w:hyperlink w:anchor="_Toc614923" w:history="1">
         <w:r>
           <w:rPr>
             <w:rStyle w:val="Hyperlink"/>
@@ -1070,7 +1079,7 @@
             <w:noProof/>
             <w:webHidden/>
           </w:rPr>
-          <w:instrText xml:space="preserve"> PAGEREF _Toc612406 \h </w:instrText>
+          <w:instrText xml:space="preserve"> PAGEREF _Toc614923 \h </w:instrText>
         </w:r>
         <w:r>
           <w:rPr>
@@ -1115,7 +1124,7 @@
           <w:szCs w:val="24"/>
         </w:rPr>
       </w:pPr>
-      <w:hyperlink w:anchor="_Toc612407" w:history="1">
+      <w:hyperlink w:anchor="_Toc614924" w:history="1">
         <w:r>
           <w:rPr>
             <w:rStyle w:val="Hyperlink"/>
@@ -1142,7 +1151,7 @@
             <w:noProof/>
             <w:webHidden/>
           </w:rPr>
-          <w:instrText xml:space="preserve"> PAGEREF _Toc612407 \h </w:instrText>
+          <w:instrText xml:space="preserve"> PAGEREF _Toc614924 \h </w:instrText>
         </w:r>
         <w:r>
           <w:rPr>
@@ -1162,7 +1171,7 @@
             <w:noProof/>
             <w:webHidden/>
           </w:rPr>
-          <w:t>7</w:t>
+          <w:t>8</w:t>
         </w:r>
         <w:r>
           <w:rPr>
@@ -1189,7 +1198,7 @@
           <w:szCs w:val="24"/>
         </w:rPr>
       </w:pPr>
-      <w:hyperlink w:anchor="_Toc612408" w:history="1">
+      <w:hyperlink w:anchor="_Toc614925" w:history="1">
         <w:r>
           <w:rPr>
             <w:rStyle w:val="Hyperlink"/>
@@ -1216,7 +1225,7 @@
             <w:noProof/>
             <w:webHidden/>
           </w:rPr>
-          <w:instrText xml:space="preserve"> PAGEREF _Toc612408 \h </w:instrText>
+          <w:instrText xml:space="preserve"> PAGEREF _Toc614925 \h </w:instrText>
         </w:r>
         <w:r>
           <w:rPr>
@@ -1236,7 +1245,7 @@
             <w:noProof/>
             <w:webHidden/>
           </w:rPr>
-          <w:t>8</w:t>
+          <w:t>9</w:t>
         </w:r>
         <w:r>
           <w:rPr>
@@ -1261,7 +1270,7 @@
           <w:szCs w:val="24"/>
         </w:rPr>
       </w:pPr>
-      <w:hyperlink w:anchor="_Toc612409" w:history="1">
+      <w:hyperlink w:anchor="_Toc614926" w:history="1">
         <w:r>
           <w:rPr>
             <w:rStyle w:val="Hyperlink"/>
@@ -1288,7 +1297,7 @@
             <w:noProof/>
             <w:webHidden/>
           </w:rPr>
-          <w:instrText xml:space="preserve"> PAGEREF _Toc612409 \h </w:instrText>
+          <w:instrText xml:space="preserve"> PAGEREF _Toc614926 \h </w:instrText>
         </w:r>
         <w:r>
           <w:rPr>
@@ -1308,7 +1317,7 @@
             <w:noProof/>
             <w:webHidden/>
           </w:rPr>
-          <w:t>8</w:t>
+          <w:t>9</w:t>
         </w:r>
         <w:r>
           <w:rPr>
@@ -1333,7 +1342,7 @@
           <w:szCs w:val="24"/>
         </w:rPr>
       </w:pPr>
-      <w:hyperlink w:anchor="_Toc612410" w:history="1">
+      <w:hyperlink w:anchor="_Toc614927" w:history="1">
         <w:r>
           <w:rPr>
             <w:rStyle w:val="Hyperlink"/>
@@ -1360,7 +1369,7 @@
             <w:noProof/>
             <w:webHidden/>
           </w:rPr>
-          <w:instrText xml:space="preserve"> PAGEREF _Toc612410 \h </w:instrText>
+          <w:instrText xml:space="preserve"> PAGEREF _Toc614927 \h </w:instrText>
         </w:r>
         <w:r>
           <w:rPr>
@@ -1380,7 +1389,7 @@
             <w:noProof/>
             <w:webHidden/>
           </w:rPr>
-          <w:t>8</w:t>
+          <w:t>9</w:t>
         </w:r>
         <w:r>
           <w:rPr>
@@ -1405,7 +1414,7 @@
           <w:szCs w:val="24"/>
         </w:rPr>
       </w:pPr>
-      <w:hyperlink w:anchor="_Toc612411" w:history="1">
+      <w:hyperlink w:anchor="_Toc614928" w:history="1">
         <w:r>
           <w:rPr>
             <w:rStyle w:val="Hyperlink"/>
@@ -1432,7 +1441,7 @@
             <w:noProof/>
             <w:webHidden/>
           </w:rPr>
-          <w:instrText xml:space="preserve"> PAGEREF _Toc612411 \h </w:instrText>
+          <w:instrText xml:space="preserve"> PAGEREF _Toc614928 \h </w:instrText>
         </w:r>
         <w:r>
           <w:rPr>
@@ -1452,7 +1461,7 @@
             <w:noProof/>
             <w:webHidden/>
           </w:rPr>
-          <w:t>8</w:t>
+          <w:t>9</w:t>
         </w:r>
         <w:r>
           <w:rPr>
@@ -1477,7 +1486,7 @@
           <w:szCs w:val="24"/>
         </w:rPr>
       </w:pPr>
-      <w:hyperlink w:anchor="_Toc612412" w:history="1">
+      <w:hyperlink w:anchor="_Toc614929" w:history="1">
         <w:r>
           <w:rPr>
             <w:rStyle w:val="Hyperlink"/>
@@ -1504,7 +1513,7 @@
             <w:noProof/>
             <w:webHidden/>
           </w:rPr>
-          <w:instrText xml:space="preserve"> PAGEREF _Toc612412 \h </w:instrText>
+          <w:instrText xml:space="preserve"> PAGEREF _Toc614929 \h </w:instrText>
         </w:r>
         <w:r>
           <w:rPr>
@@ -1524,7 +1533,7 @@
             <w:noProof/>
             <w:webHidden/>
           </w:rPr>
-          <w:t>8</w:t>
+          <w:t>9</w:t>
         </w:r>
         <w:r>
           <w:rPr>
@@ -1549,7 +1558,7 @@
           <w:szCs w:val="24"/>
         </w:rPr>
       </w:pPr>
-      <w:hyperlink w:anchor="_Toc612413" w:history="1">
+      <w:hyperlink w:anchor="_Toc614930" w:history="1">
         <w:r>
           <w:rPr>
             <w:rStyle w:val="Hyperlink"/>
@@ -1576,7 +1585,7 @@
             <w:noProof/>
             <w:webHidden/>
           </w:rPr>
-          <w:instrText xml:space="preserve"> PAGEREF _Toc612413 \h </w:instrText>
+          <w:instrText xml:space="preserve"> PAGEREF _Toc614930 \h </w:instrText>
         </w:r>
         <w:r>
           <w:rPr>
@@ -1596,7 +1605,7 @@
             <w:noProof/>
             <w:webHidden/>
           </w:rPr>
-          <w:t>8</w:t>
+          <w:t>9</w:t>
         </w:r>
         <w:r>
           <w:rPr>
@@ -1621,7 +1630,7 @@
           <w:szCs w:val="24"/>
         </w:rPr>
       </w:pPr>
-      <w:hyperlink w:anchor="_Toc612414" w:history="1">
+      <w:hyperlink w:anchor="_Toc614931" w:history="1">
         <w:r>
           <w:rPr>
             <w:rStyle w:val="Hyperlink"/>
@@ -1648,7 +1657,7 @@
             <w:noProof/>
             <w:webHidden/>
           </w:rPr>
-          <w:instrText xml:space="preserve"> PAGEREF _Toc612414 \h </w:instrText>
+          <w:instrText xml:space="preserve"> PAGEREF _Toc614931 \h </w:instrText>
         </w:r>
         <w:r>
           <w:rPr>
@@ -1668,7 +1677,7 @@
             <w:noProof/>
             <w:webHidden/>
           </w:rPr>
-          <w:t>9</w:t>
+          <w:t>10</w:t>
         </w:r>
         <w:r>
           <w:rPr>
@@ -1693,7 +1702,7 @@
           <w:szCs w:val="24"/>
         </w:rPr>
       </w:pPr>
-      <w:hyperlink w:anchor="_Toc612415" w:history="1">
+      <w:hyperlink w:anchor="_Toc614932" w:history="1">
         <w:r>
           <w:rPr>
             <w:rStyle w:val="Hyperlink"/>
@@ -1720,7 +1729,7 @@
             <w:noProof/>
             <w:webHidden/>
           </w:rPr>
-          <w:instrText xml:space="preserve"> PAGEREF _Toc612415 \h </w:instrText>
+          <w:instrText xml:space="preserve"> PAGEREF _Toc614932 \h </w:instrText>
         </w:r>
         <w:r>
           <w:rPr>
@@ -1740,7 +1749,7 @@
             <w:noProof/>
             <w:webHidden/>
           </w:rPr>
-          <w:t>9</w:t>
+          <w:t>10</w:t>
         </w:r>
         <w:r>
           <w:rPr>
@@ -1765,7 +1774,7 @@
           <w:szCs w:val="24"/>
         </w:rPr>
       </w:pPr>
-      <w:hyperlink w:anchor="_Toc612416" w:history="1">
+      <w:hyperlink w:anchor="_Toc614933" w:history="1">
         <w:r>
           <w:rPr>
             <w:rStyle w:val="Hyperlink"/>
@@ -1792,7 +1801,7 @@
             <w:noProof/>
             <w:webHidden/>
           </w:rPr>
-          <w:instrText xml:space="preserve"> PAGEREF _Toc612416 \h </w:instrText>
+          <w:instrText xml:space="preserve"> PAGEREF _Toc614933 \h </w:instrText>
         </w:r>
         <w:r>
           <w:rPr>
@@ -1812,7 +1821,7 @@
             <w:noProof/>
             <w:webHidden/>
           </w:rPr>
-          <w:t>9</w:t>
+          <w:t>10</w:t>
         </w:r>
         <w:r>
           <w:rPr>
@@ -1837,7 +1846,7 @@
           <w:szCs w:val="24"/>
         </w:rPr>
       </w:pPr>
-      <w:hyperlink w:anchor="_Toc612417" w:history="1">
+      <w:hyperlink w:anchor="_Toc614934" w:history="1">
         <w:r>
           <w:rPr>
             <w:rStyle w:val="Hyperlink"/>
@@ -1864,7 +1873,7 @@
             <w:noProof/>
             <w:webHidden/>
           </w:rPr>
-          <w:instrText xml:space="preserve"> PAGEREF _Toc612417 \h </w:instrText>
+          <w:instrText xml:space="preserve"> PAGEREF _Toc614934 \h </w:instrText>
         </w:r>
         <w:r>
           <w:rPr>
@@ -1884,7 +1893,7 @@
             <w:noProof/>
             <w:webHidden/>
           </w:rPr>
-          <w:t>9</w:t>
+          <w:t>10</w:t>
         </w:r>
         <w:r>
           <w:rPr>
@@ -1909,7 +1918,7 @@
           <w:szCs w:val="24"/>
         </w:rPr>
       </w:pPr>
-      <w:hyperlink w:anchor="_Toc612418" w:history="1">
+      <w:hyperlink w:anchor="_Toc614935" w:history="1">
         <w:r>
           <w:rPr>
             <w:rStyle w:val="Hyperlink"/>
@@ -1936,7 +1945,7 @@
             <w:noProof/>
             <w:webHidden/>
           </w:rPr>
-          <w:instrText xml:space="preserve"> PAGEREF _Toc612418 \h </w:instrText>
+          <w:instrText xml:space="preserve"> PAGEREF _Toc614935 \h </w:instrText>
         </w:r>
         <w:r>
           <w:rPr>
@@ -1956,7 +1965,7 @@
             <w:noProof/>
             <w:webHidden/>
           </w:rPr>
-          <w:t>9</w:t>
+          <w:t>10</w:t>
         </w:r>
         <w:r>
           <w:rPr>
@@ -1981,7 +1990,7 @@
           <w:szCs w:val="24"/>
         </w:rPr>
       </w:pPr>
-      <w:hyperlink w:anchor="_Toc612419" w:history="1">
+      <w:hyperlink w:anchor="_Toc614936" w:history="1">
         <w:r>
           <w:rPr>
             <w:rStyle w:val="Hyperlink"/>
@@ -2008,7 +2017,7 @@
             <w:noProof/>
             <w:webHidden/>
           </w:rPr>
-          <w:instrText xml:space="preserve"> PAGEREF _Toc612419 \h </w:instrText>
+          <w:instrText xml:space="preserve"> PAGEREF _Toc614936 \h </w:instrText>
         </w:r>
         <w:r>
           <w:rPr>
@@ -2028,7 +2037,7 @@
             <w:noProof/>
             <w:webHidden/>
           </w:rPr>
-          <w:t>9</w:t>
+          <w:t>10</w:t>
         </w:r>
         <w:r>
           <w:rPr>
@@ -2053,7 +2062,7 @@
           <w:szCs w:val="24"/>
         </w:rPr>
       </w:pPr>
-      <w:hyperlink w:anchor="_Toc612420" w:history="1">
+      <w:hyperlink w:anchor="_Toc614937" w:history="1">
         <w:r>
           <w:rPr>
             <w:rStyle w:val="Hyperlink"/>
@@ -2080,7 +2089,7 @@
             <w:noProof/>
             <w:webHidden/>
           </w:rPr>
-          <w:instrText xml:space="preserve"> PAGEREF _Toc612420 \h </w:instrText>
+          <w:instrText xml:space="preserve"> PAGEREF _Toc614937 \h </w:instrText>
         </w:r>
         <w:r>
           <w:rPr>
@@ -2100,7 +2109,7 @@
             <w:noProof/>
             <w:webHidden/>
           </w:rPr>
-          <w:t>10</w:t>
+          <w:t>11</w:t>
         </w:r>
         <w:r>
           <w:rPr>
@@ -2125,7 +2134,7 @@
           <w:szCs w:val="24"/>
         </w:rPr>
       </w:pPr>
-      <w:hyperlink w:anchor="_Toc612421" w:history="1">
+      <w:hyperlink w:anchor="_Toc614938" w:history="1">
         <w:r>
           <w:rPr>
             <w:rStyle w:val="Hyperlink"/>
@@ -2152,7 +2161,7 @@
             <w:noProof/>
             <w:webHidden/>
           </w:rPr>
-          <w:instrText xml:space="preserve"> PAGEREF _Toc612421 \h </w:instrText>
+          <w:instrText xml:space="preserve"> PAGEREF _Toc614938 \h </w:instrText>
         </w:r>
         <w:r>
           <w:rPr>
@@ -2172,7 +2181,7 @@
             <w:noProof/>
             <w:webHidden/>
           </w:rPr>
-          <w:t>10</w:t>
+          <w:t>11</w:t>
         </w:r>
         <w:r>
           <w:rPr>
@@ -2197,7 +2206,7 @@
           <w:szCs w:val="24"/>
         </w:rPr>
       </w:pPr>
-      <w:hyperlink w:anchor="_Toc612422" w:history="1">
+      <w:hyperlink w:anchor="_Toc614939" w:history="1">
         <w:r>
           <w:rPr>
             <w:rStyle w:val="Hyperlink"/>
@@ -2224,7 +2233,7 @@
             <w:noProof/>
             <w:webHidden/>
           </w:rPr>
-          <w:instrText xml:space="preserve"> PAGEREF _Toc612422 \h </w:instrText>
+          <w:instrText xml:space="preserve"> PAGEREF _Toc614939 \h </w:instrText>
         </w:r>
         <w:r>
           <w:rPr>
@@ -2244,7 +2253,7 @@
             <w:noProof/>
             <w:webHidden/>
           </w:rPr>
-          <w:t>10</w:t>
+          <w:t>11</w:t>
         </w:r>
         <w:r>
           <w:rPr>
@@ -2269,7 +2278,7 @@
           <w:szCs w:val="24"/>
         </w:rPr>
       </w:pPr>
-      <w:hyperlink w:anchor="_Toc612423" w:history="1">
+      <w:hyperlink w:anchor="_Toc614940" w:history="1">
         <w:r>
           <w:rPr>
             <w:rStyle w:val="Hyperlink"/>
@@ -2296,7 +2305,7 @@
             <w:noProof/>
             <w:webHidden/>
           </w:rPr>
-          <w:instrText xml:space="preserve"> PAGEREF _Toc612423 \h </w:instrText>
+          <w:instrText xml:space="preserve"> PAGEREF _Toc614940 \h </w:instrText>
         </w:r>
         <w:r>
           <w:rPr>
@@ -2316,7 +2325,7 @@
             <w:noProof/>
             <w:webHidden/>
           </w:rPr>
-          <w:t>10</w:t>
+          <w:t>11</w:t>
         </w:r>
         <w:r>
           <w:rPr>
@@ -2341,7 +2350,7 @@
           <w:szCs w:val="24"/>
         </w:rPr>
       </w:pPr>
-      <w:hyperlink w:anchor="_Toc612424" w:history="1">
+      <w:hyperlink w:anchor="_Toc614941" w:history="1">
         <w:r>
           <w:rPr>
             <w:rStyle w:val="Hyperlink"/>
@@ -2368,7 +2377,7 @@
             <w:noProof/>
             <w:webHidden/>
           </w:rPr>
-          <w:instrText xml:space="preserve"> PAGEREF _Toc612424 \h </w:instrText>
+          <w:instrText xml:space="preserve"> PAGEREF _Toc614941 \h </w:instrText>
         </w:r>
         <w:r>
           <w:rPr>
@@ -2388,7 +2397,7 @@
             <w:noProof/>
             <w:webHidden/>
           </w:rPr>
-          <w:t>10</w:t>
+          <w:t>11</w:t>
         </w:r>
         <w:r>
           <w:rPr>
@@ -2413,7 +2422,7 @@
           <w:szCs w:val="24"/>
         </w:rPr>
       </w:pPr>
-      <w:hyperlink w:anchor="_Toc612425" w:history="1">
+      <w:hyperlink w:anchor="_Toc614942" w:history="1">
         <w:r>
           <w:rPr>
             <w:rStyle w:val="Hyperlink"/>
@@ -2440,7 +2449,7 @@
             <w:noProof/>
             <w:webHidden/>
           </w:rPr>
-          <w:instrText xml:space="preserve"> PAGEREF _Toc612425 \h </w:instrText>
+          <w:instrText xml:space="preserve"> PAGEREF _Toc614942 \h </w:instrText>
         </w:r>
         <w:r>
           <w:rPr>
@@ -2460,7 +2469,7 @@
             <w:noProof/>
             <w:webHidden/>
           </w:rPr>
-          <w:t>10</w:t>
+          <w:t>11</w:t>
         </w:r>
         <w:r>
           <w:rPr>
@@ -2485,7 +2494,7 @@
           <w:szCs w:val="24"/>
         </w:rPr>
       </w:pPr>
-      <w:hyperlink w:anchor="_Toc612426" w:history="1">
+      <w:hyperlink w:anchor="_Toc614943" w:history="1">
         <w:r>
           <w:rPr>
             <w:rStyle w:val="Hyperlink"/>
@@ -2512,7 +2521,7 @@
             <w:noProof/>
             <w:webHidden/>
           </w:rPr>
-          <w:instrText xml:space="preserve"> PAGEREF _Toc612426 \h </w:instrText>
+          <w:instrText xml:space="preserve"> PAGEREF _Toc614943 \h </w:instrText>
         </w:r>
         <w:r>
           <w:rPr>
@@ -2532,7 +2541,7 @@
             <w:noProof/>
             <w:webHidden/>
           </w:rPr>
-          <w:t>11</w:t>
+          <w:t>12</w:t>
         </w:r>
         <w:r>
           <w:rPr>
@@ -2557,7 +2566,7 @@
           <w:szCs w:val="24"/>
         </w:rPr>
       </w:pPr>
-      <w:hyperlink w:anchor="_Toc612427" w:history="1">
+      <w:hyperlink w:anchor="_Toc614944" w:history="1">
         <w:r>
           <w:rPr>
             <w:rStyle w:val="Hyperlink"/>
@@ -2584,7 +2593,7 @@
             <w:noProof/>
             <w:webHidden/>
           </w:rPr>
-          <w:instrText xml:space="preserve"> PAGEREF _Toc612427 \h </w:instrText>
+          <w:instrText xml:space="preserve"> PAGEREF _Toc614944 \h </w:instrText>
         </w:r>
         <w:r>
           <w:rPr>
@@ -2604,7 +2613,7 @@
             <w:noProof/>
             <w:webHidden/>
           </w:rPr>
-          <w:t>11</w:t>
+          <w:t>12</w:t>
         </w:r>
         <w:r>
           <w:rPr>
@@ -2629,7 +2638,7 @@
           <w:szCs w:val="24"/>
         </w:rPr>
       </w:pPr>
-      <w:hyperlink w:anchor="_Toc612428" w:history="1">
+      <w:hyperlink w:anchor="_Toc614945" w:history="1">
         <w:r>
           <w:rPr>
             <w:rStyle w:val="Hyperlink"/>
@@ -2656,7 +2665,7 @@
             <w:noProof/>
             <w:webHidden/>
           </w:rPr>
-          <w:instrText xml:space="preserve"> PAGEREF _Toc612428 \h </w:instrText>
+          <w:instrText xml:space="preserve"> PAGEREF _Toc614945 \h </w:instrText>
         </w:r>
         <w:r>
           <w:rPr>
@@ -2676,7 +2685,7 @@
             <w:noProof/>
             <w:webHidden/>
           </w:rPr>
-          <w:t>11</w:t>
+          <w:t>12</w:t>
         </w:r>
         <w:r>
           <w:rPr>
@@ -2701,7 +2710,7 @@
           <w:szCs w:val="24"/>
         </w:rPr>
       </w:pPr>
-      <w:hyperlink w:anchor="_Toc612429" w:history="1">
+      <w:hyperlink w:anchor="_Toc614946" w:history="1">
         <w:r>
           <w:rPr>
             <w:rStyle w:val="Hyperlink"/>
@@ -2728,7 +2737,7 @@
             <w:noProof/>
             <w:webHidden/>
           </w:rPr>
-          <w:instrText xml:space="preserve"> PAGEREF _Toc612429 \h </w:instrText>
+          <w:instrText xml:space="preserve"> PAGEREF _Toc614946 \h </w:instrText>
         </w:r>
         <w:r>
           <w:rPr>
@@ -2748,7 +2757,7 @@
             <w:noProof/>
             <w:webHidden/>
           </w:rPr>
-          <w:t>11</w:t>
+          <w:t>12</w:t>
         </w:r>
         <w:r>
           <w:rPr>
@@ -2773,7 +2782,7 @@
           <w:szCs w:val="24"/>
         </w:rPr>
       </w:pPr>
-      <w:hyperlink w:anchor="_Toc612430" w:history="1">
+      <w:hyperlink w:anchor="_Toc614947" w:history="1">
         <w:r>
           <w:rPr>
             <w:rStyle w:val="Hyperlink"/>
@@ -2800,7 +2809,7 @@
             <w:noProof/>
             <w:webHidden/>
           </w:rPr>
-          <w:instrText xml:space="preserve"> PAGEREF _Toc612430 \h </w:instrText>
+          <w:instrText xml:space="preserve"> PAGEREF _Toc614947 \h </w:instrText>
         </w:r>
         <w:r>
           <w:rPr>
@@ -2820,7 +2829,7 @@
             <w:noProof/>
             <w:webHidden/>
           </w:rPr>
-          <w:t>12</w:t>
+          <w:t>13</w:t>
         </w:r>
         <w:r>
           <w:rPr>
@@ -2845,7 +2854,7 @@
           <w:szCs w:val="24"/>
         </w:rPr>
       </w:pPr>
-      <w:hyperlink w:anchor="_Toc612431" w:history="1">
+      <w:hyperlink w:anchor="_Toc614948" w:history="1">
         <w:r>
           <w:rPr>
             <w:rStyle w:val="Hyperlink"/>
@@ -2872,7 +2881,7 @@
             <w:noProof/>
             <w:webHidden/>
           </w:rPr>
-          <w:instrText xml:space="preserve"> PAGEREF _Toc612431 \h </w:instrText>
+          <w:instrText xml:space="preserve"> PAGEREF _Toc614948 \h </w:instrText>
         </w:r>
         <w:r>
           <w:rPr>
@@ -2892,7 +2901,7 @@
             <w:noProof/>
             <w:webHidden/>
           </w:rPr>
-          <w:t>12</w:t>
+          <w:t>13</w:t>
         </w:r>
         <w:r>
           <w:rPr>
@@ -2917,7 +2926,7 @@
           <w:szCs w:val="24"/>
         </w:rPr>
       </w:pPr>
-      <w:hyperlink w:anchor="_Toc612432" w:history="1">
+      <w:hyperlink w:anchor="_Toc614949" w:history="1">
         <w:r>
           <w:rPr>
             <w:rStyle w:val="Hyperlink"/>
@@ -2944,7 +2953,7 @@
             <w:noProof/>
             <w:webHidden/>
           </w:rPr>
-          <w:instrText xml:space="preserve"> PAGEREF _Toc612432 \h </w:instrText>
+          <w:instrText xml:space="preserve"> PAGEREF _Toc614949 \h </w:instrText>
         </w:r>
         <w:r>
           <w:rPr>
@@ -2964,7 +2973,7 @@
             <w:noProof/>
             <w:webHidden/>
           </w:rPr>
-          <w:t>12</w:t>
+          <w:t>13</w:t>
         </w:r>
         <w:r>
           <w:rPr>
@@ -2989,7 +2998,7 @@
           <w:szCs w:val="24"/>
         </w:rPr>
       </w:pPr>
-      <w:hyperlink w:anchor="_Toc612433" w:history="1">
+      <w:hyperlink w:anchor="_Toc614950" w:history="1">
         <w:r>
           <w:rPr>
             <w:rStyle w:val="Hyperlink"/>
@@ -3016,7 +3025,7 @@
             <w:noProof/>
             <w:webHidden/>
           </w:rPr>
-          <w:instrText xml:space="preserve"> PAGEREF _Toc612433 \h </w:instrText>
+          <w:instrText xml:space="preserve"> PAGEREF _Toc614950 \h </w:instrText>
         </w:r>
         <w:r>
           <w:rPr>
@@ -3036,7 +3045,7 @@
             <w:noProof/>
             <w:webHidden/>
           </w:rPr>
-          <w:t>13</w:t>
+          <w:t>14</w:t>
         </w:r>
         <w:r>
           <w:rPr>
@@ -3061,7 +3070,7 @@
           <w:szCs w:val="24"/>
         </w:rPr>
       </w:pPr>
-      <w:hyperlink w:anchor="_Toc612434" w:history="1">
+      <w:hyperlink w:anchor="_Toc614951" w:history="1">
         <w:r>
           <w:rPr>
             <w:rStyle w:val="Hyperlink"/>
@@ -3088,7 +3097,7 @@
             <w:noProof/>
             <w:webHidden/>
           </w:rPr>
-          <w:instrText xml:space="preserve"> PAGEREF _Toc612434 \h </w:instrText>
+          <w:instrText xml:space="preserve"> PAGEREF _Toc614951 \h </w:instrText>
         </w:r>
         <w:r>
           <w:rPr>
@@ -3108,7 +3117,151 @@
             <w:noProof/>
             <w:webHidden/>
           </w:rPr>
-          <w:t>13</w:t>
+          <w:t>14</w:t>
+        </w:r>
+        <w:r>
+          <w:rPr>
+            <w:noProof/>
+            <w:webHidden/>
+          </w:rPr>
+          <w:fldChar w:fldCharType="end"/>
+        </w:r>
+      </w:hyperlink>
+    </w:p>
+    <w:p>
+      <w:pPr>
+        <w:pStyle w:val="TOC2"/>
+        <w:tabs>
+          <w:tab w:val="right" w:leader="dot" w:pos="9010"/>
+        </w:tabs>
+        <w:rPr>
+          <w:rFonts w:eastAsiaTheme="minorEastAsia"/>
+          <w:smallCaps w:val="0"/>
+          <w:noProof/>
+          <w:sz w:val="24"/>
+          <w:szCs w:val="24"/>
+        </w:rPr>
+      </w:pPr>
+      <w:hyperlink w:anchor="_Toc614952" w:history="1">
+        <w:r>
+          <w:rPr>
+            <w:rStyle w:val="Hyperlink"/>
+            <w:noProof/>
+          </w:rPr>
+          <w:t>Timing Commands</w:t>
+        </w:r>
+        <w:r>
+          <w:rPr>
+            <w:noProof/>
+            <w:webHidden/>
+          </w:rPr>
+          <w:tab/>
+        </w:r>
+        <w:r>
+          <w:rPr>
+            <w:noProof/>
+            <w:webHidden/>
+          </w:rPr>
+          <w:fldChar w:fldCharType="begin"/>
+        </w:r>
+        <w:r>
+          <w:rPr>
+            <w:noProof/>
+            <w:webHidden/>
+          </w:rPr>
+          <w:instrText xml:space="preserve"> PAGEREF _Toc614952 \h </w:instrText>
+        </w:r>
+        <w:r>
+          <w:rPr>
+            <w:noProof/>
+            <w:webHidden/>
+          </w:rPr>
+        </w:r>
+        <w:r>
+          <w:rPr>
+            <w:noProof/>
+            <w:webHidden/>
+          </w:rPr>
+          <w:fldChar w:fldCharType="separate"/>
+        </w:r>
+        <w:r>
+          <w:rPr>
+            <w:noProof/>
+            <w:webHidden/>
+          </w:rPr>
+          <w:t>14</w:t>
+        </w:r>
+        <w:r>
+          <w:rPr>
+            <w:noProof/>
+            <w:webHidden/>
+          </w:rPr>
+          <w:fldChar w:fldCharType="end"/>
+        </w:r>
+      </w:hyperlink>
+    </w:p>
+    <w:p>
+      <w:pPr>
+        <w:pStyle w:val="TOC2"/>
+        <w:tabs>
+          <w:tab w:val="right" w:leader="dot" w:pos="9010"/>
+        </w:tabs>
+        <w:rPr>
+          <w:rFonts w:eastAsiaTheme="minorEastAsia"/>
+          <w:smallCaps w:val="0"/>
+          <w:noProof/>
+          <w:sz w:val="24"/>
+          <w:szCs w:val="24"/>
+        </w:rPr>
+      </w:pPr>
+      <w:hyperlink w:anchor="_Toc614953" w:history="1">
+        <w:r>
+          <w:rPr>
+            <w:rStyle w:val="Hyperlink"/>
+            <w:noProof/>
+          </w:rPr>
+          <w:t>Scripting</w:t>
+        </w:r>
+        <w:r>
+          <w:rPr>
+            <w:noProof/>
+            <w:webHidden/>
+          </w:rPr>
+          <w:tab/>
+        </w:r>
+        <w:r>
+          <w:rPr>
+            <w:noProof/>
+            <w:webHidden/>
+          </w:rPr>
+          <w:fldChar w:fldCharType="begin"/>
+        </w:r>
+        <w:r>
+          <w:rPr>
+            <w:noProof/>
+            <w:webHidden/>
+          </w:rPr>
+          <w:instrText xml:space="preserve"> PAGEREF _Toc614953 \h </w:instrText>
+        </w:r>
+        <w:r>
+          <w:rPr>
+            <w:noProof/>
+            <w:webHidden/>
+          </w:rPr>
+        </w:r>
+        <w:r>
+          <w:rPr>
+            <w:noProof/>
+            <w:webHidden/>
+          </w:rPr>
+          <w:fldChar w:fldCharType="separate"/>
+        </w:r>
+        <w:r>
+          <w:rPr>
+            <w:noProof/>
+            <w:webHidden/>
+          </w:rPr>
+          <w:t>14</w:t>
         </w:r>
         <w:r>
           <w:rPr>
@@ -3135,13 +3288,13 @@
           <w:szCs w:val="24"/>
         </w:rPr>
       </w:pPr>
-      <w:hyperlink w:anchor="_Toc612435" w:history="1">
+      <w:hyperlink w:anchor="_Toc614954" w:history="1">
         <w:r>
           <w:rPr>
             <w:rStyle w:val="Hyperlink"/>
             <w:noProof/>
           </w:rPr>
-          <w:t>Supported Column Types</w:t>
+          <w:t>Fetching Rows Using Indexes</w:t>
         </w:r>
         <w:r>
           <w:rPr>
@@ -3162,7 +3315,7 @@
             <w:noProof/>
             <w:webHidden/>
           </w:rPr>
-          <w:instrText xml:space="preserve"> PAGEREF _Toc612435 \h </w:instrText>
+          <w:instrText xml:space="preserve"> PAGEREF _Toc614954 \h </w:instrText>
         </w:r>
         <w:r>
           <w:rPr>
@@ -3182,7 +3335,7 @@
             <w:noProof/>
             <w:webHidden/>
           </w:rPr>
-          <w:t>14</w:t>
+          <w:t>15</w:t>
         </w:r>
         <w:r>
           <w:rPr>
@@ -3209,13 +3362,13 @@
           <w:szCs w:val="24"/>
         </w:rPr>
       </w:pPr>
-      <w:hyperlink w:anchor="_Toc612436" w:history="1">
+      <w:hyperlink w:anchor="_Toc614955" w:history="1">
         <w:r>
           <w:rPr>
             <w:rStyle w:val="Hyperlink"/>
             <w:noProof/>
           </w:rPr>
-          <w:t>Timing Commands</w:t>
+          <w:t>Appendix A – Command Line Arguments</w:t>
         </w:r>
         <w:r>
           <w:rPr>
@@ -3236,7 +3389,7 @@
             <w:noProof/>
             <w:webHidden/>
           </w:rPr>
-          <w:instrText xml:space="preserve"> PAGEREF _Toc612436 \h </w:instrText>
+          <w:instrText xml:space="preserve"> PAGEREF _Toc614955 \h </w:instrText>
         </w:r>
         <w:r>
           <w:rPr>
@@ -3256,7 +3409,7 @@
             <w:noProof/>
             <w:webHidden/>
           </w:rPr>
-          <w:t>14</w:t>
+          <w:t>17</w:t>
         </w:r>
         <w:r>
           <w:rPr>
@@ -3283,13 +3436,13 @@
           <w:szCs w:val="24"/>
         </w:rPr>
       </w:pPr>
-      <w:hyperlink w:anchor="_Toc612437" w:history="1">
+      <w:hyperlink w:anchor="_Toc614956" w:history="1">
         <w:r>
           <w:rPr>
             <w:rStyle w:val="Hyperlink"/>
             <w:noProof/>
           </w:rPr>
-          <w:t>Scripting</w:t>
+          <w:t>Appendix B – Prompt Functions</w:t>
         </w:r>
         <w:r>
           <w:rPr>
@@ -3310,7 +3463,7 @@
             <w:noProof/>
             <w:webHidden/>
           </w:rPr>
-          <w:instrText xml:space="preserve"> PAGEREF _Toc612437 \h </w:instrText>
+          <w:instrText xml:space="preserve"> PAGEREF _Toc614956 \h </w:instrText>
         </w:r>
         <w:r>
           <w:rPr>
@@ -3330,7 +3483,7 @@
             <w:noProof/>
             <w:webHidden/>
           </w:rPr>
-          <w:t>14</w:t>
+          <w:t>17</w:t>
         </w:r>
         <w:r>
           <w:rPr>
@@ -3357,13 +3510,13 @@
           <w:szCs w:val="24"/>
         </w:rPr>
       </w:pPr>
-      <w:hyperlink w:anchor="_Toc612438" w:history="1">
+      <w:hyperlink w:anchor="_Toc614957" w:history="1">
         <w:r>
           <w:rPr>
             <w:rStyle w:val="Hyperlink"/>
             <w:noProof/>
           </w:rPr>
-          <w:t>Limitations and Restrictions</w:t>
+          <w:t>Appendix C – Supported Column Types</w:t>
         </w:r>
         <w:r>
           <w:rPr>
@@ -3384,7 +3537,7 @@
             <w:noProof/>
             <w:webHidden/>
           </w:rPr>
-          <w:instrText xml:space="preserve"> PAGEREF _Toc612438 \h </w:instrText>
+          <w:instrText xml:space="preserve"> PAGEREF _Toc614957 \h </w:instrText>
         </w:r>
         <w:r>
           <w:rPr>
@@ -3404,7 +3557,7 @@
             <w:noProof/>
             <w:webHidden/>
           </w:rPr>
-          <w:t>15</w:t>
+          <w:t>18</w:t>
         </w:r>
         <w:r>
           <w:rPr>
@@ -3431,13 +3584,13 @@
           <w:szCs w:val="24"/>
         </w:rPr>
       </w:pPr>
-      <w:hyperlink w:anchor="_Toc612439" w:history="1">
+      <w:hyperlink w:anchor="_Toc614958" w:history="1">
         <w:r>
           <w:rPr>
             <w:rStyle w:val="Hyperlink"/>
             <w:noProof/>
           </w:rPr>
-          <w:t>Fetching Rows Using Indexes</w:t>
+          <w:t>Appendix D – Limitations and Restrictions</w:t>
         </w:r>
         <w:r>
           <w:rPr>
@@ -3458,7 +3611,7 @@
             <w:noProof/>
             <w:webHidden/>
           </w:rPr>
-          <w:instrText xml:space="preserve"> PAGEREF _Toc612439 \h </w:instrText>
+          <w:instrText xml:space="preserve"> PAGEREF _Toc614958 \h </w:instrText>
         </w:r>
         <w:r>
           <w:rPr>
@@ -3478,7 +3631,7 @@
             <w:noProof/>
             <w:webHidden/>
           </w:rPr>
-          <w:t>16</w:t>
+          <w:t>18</w:t>
         </w:r>
         <w:r>
           <w:rPr>
@@ -3505,13 +3658,13 @@
           <w:szCs w:val="24"/>
         </w:rPr>
       </w:pPr>
-      <w:hyperlink w:anchor="_Toc612440" w:history="1">
+      <w:hyperlink w:anchor="_Toc614959" w:history="1">
         <w:r>
           <w:rPr>
             <w:rStyle w:val="Hyperlink"/>
             <w:noProof/>
           </w:rPr>
-          <w:t>Appendix A – Command Line Arguments</w:t>
+          <w:t>Appendix E – Seth Test Harness</w:t>
         </w:r>
         <w:r>
           <w:rPr>
@@ -3532,7 +3685,7 @@
             <w:noProof/>
             <w:webHidden/>
           </w:rPr>
-          <w:instrText xml:space="preserve"> PAGEREF _Toc612440 \h </w:instrText>
+          <w:instrText xml:space="preserve"> PAGEREF _Toc614959 \h </w:instrText>
         </w:r>
         <w:r>
           <w:rPr>
@@ -3552,7 +3705,7 @@
             <w:noProof/>
             <w:webHidden/>
           </w:rPr>
-          <w:t>17</w:t>
+          <w:t>18</w:t>
         </w:r>
         <w:r>
           <w:rPr>
@@ -3579,13 +3732,13 @@
           <w:szCs w:val="24"/>
         </w:rPr>
       </w:pPr>
-      <w:hyperlink w:anchor="_Toc612441" w:history="1">
+      <w:hyperlink w:anchor="_Toc614960" w:history="1">
         <w:r>
           <w:rPr>
             <w:rStyle w:val="Hyperlink"/>
             <w:noProof/>
           </w:rPr>
-          <w:t>Appendix B – Prompt Functions</w:t>
+          <w:t>Appendix F – Prompt Commands</w:t>
         </w:r>
         <w:r>
           <w:rPr>
@@ -3606,7 +3759,7 @@
             <w:noProof/>
             <w:webHidden/>
           </w:rPr>
-          <w:instrText xml:space="preserve"> PAGEREF _Toc612441 \h </w:instrText>
+          <w:instrText xml:space="preserve"> PAGEREF _Toc614960 \h </w:instrText>
         </w:r>
         <w:r>
           <w:rPr>
@@ -3626,7 +3779,7 @@
             <w:noProof/>
             <w:webHidden/>
           </w:rPr>
-          <w:t>18</w:t>
+          <w:t>19</w:t>
         </w:r>
         <w:r>
           <w:rPr>
@@ -3639,91 +3792,6 @@
     </w:p>
     <w:p>
       <w:pPr>
-        <w:pStyle w:val="TOC1"/>
-        <w:tabs>
-          <w:tab w:val="right" w:leader="dot" w:pos="9010"/>
-        </w:tabs>
-        <w:rPr>
-          <w:rFonts w:eastAsiaTheme="minorEastAsia"/>
-          <w:b w:val="0"/>
-          <w:bCs w:val="0"/>
-          <w:caps w:val="0"/>
-          <w:noProof/>
-          <w:sz w:val="24"/>
-          <w:szCs w:val="24"/>
-        </w:rPr>
-      </w:pPr>
-      <w:hyperlink w:anchor="_Toc612442" w:history="1">
-        <w:r>
-          <w:rPr>
-            <w:rStyle w:val="Hyperlink"/>
-            <w:noProof/>
-          </w:rPr>
-          <w:t>Appendix B – Prompt Commands</w:t>
-        </w:r>
-        <w:r>
-          <w:rPr>
-            <w:noProof/>
-            <w:webHidden/>
-          </w:rPr>
-          <w:tab/>
-        </w:r>
-        <w:r>
-          <w:rPr>
-            <w:noProof/>
-            <w:webHidden/>
-          </w:rPr>
-          <w:fldChar w:fldCharType="begin"/>
-        </w:r>
-        <w:r>
-          <w:rPr>
-            <w:noProof/>
-            <w:webHidden/>
-          </w:rPr>
-          <w:instrText xml:space="preserve"> PAGEREF _Toc612442 \h </w:instrText>
-        </w:r>
-        <w:r>
-          <w:rPr>
-            <w:noProof/>
-            <w:webHidden/>
-          </w:rPr>
-        </w:r>
-        <w:r>
-          <w:rPr>
-            <w:noProof/>
-            <w:webHidden/>
-          </w:rPr>
-          <w:fldChar w:fldCharType="separate"/>
-        </w:r>
-        <w:r>
-          <w:rPr>
-            <w:noProof/>
-            <w:webHidden/>
-          </w:rPr>
-          <w:t>19</w:t>
-        </w:r>
-        <w:r>
-          <w:rPr>
-            <w:noProof/>
-            <w:webHidden/>
-          </w:rPr>
-          <w:fldChar w:fldCharType="end"/>
-        </w:r>
-      </w:hyperlink>
-    </w:p>
-    <w:p>
-      <w:pPr>
-        <w:rPr>
-          <w:rStyle w:val="IntenseEmphasis"/>
-          <w:rFonts w:asciiTheme="majorHAnsi" w:eastAsiaTheme="majorEastAsia" w:hAnsiTheme="majorHAnsi" w:cstheme="majorBidi"/>
-          <w:i w:val="0"/>
-          <w:iCs w:val="0"/>
-          <w:color w:val="2F5496" w:themeColor="accent1" w:themeShade="BF"/>
-          <w:sz w:val="32"/>
-          <w:szCs w:val="32"/>
-        </w:rPr>
-      </w:pPr>
-      <w:r>
         <w:rPr>
           <w:rStyle w:val="IntenseEmphasis"/>
           <w:i w:val="0"/>
@@ -3731,36 +3799,27 @@
           <w:color w:val="2F5496" w:themeColor="accent1" w:themeShade="BF"/>
           <w:szCs w:val="20"/>
         </w:rPr>
-        <w:fldChar w:fldCharType="end"/>
-      </w:r>
+      </w:pPr>
       <w:r>
         <w:rPr>
           <w:rStyle w:val="IntenseEmphasis"/>
+          <w:b/>
+          <w:bCs/>
           <w:i w:val="0"/>
           <w:iCs w:val="0"/>
+          <w:caps/>
           <w:color w:val="2F5496" w:themeColor="accent1" w:themeShade="BF"/>
-        </w:rPr>
-        <w:br w:type="page"/>
+          <w:szCs w:val="20"/>
+        </w:rPr>
+        <w:fldChar w:fldCharType="end"/>
       </w:r>
     </w:p>
     <w:p>
       <w:pPr>
         <w:pStyle w:val="Heading1"/>
-        <w:rPr>
-          <w:rStyle w:val="IntenseEmphasis"/>
-          <w:i w:val="0"/>
-          <w:iCs w:val="0"/>
-          <w:color w:val="0096FF"/>
-        </w:rPr>
-      </w:pPr>
-      <w:bookmarkStart w:id="0" w:name="_Toc612395"/>
-      <w:r>
-        <w:rPr>
-          <w:rStyle w:val="IntenseEmphasis"/>
-          <w:i w:val="0"/>
-          <w:iCs w:val="0"/>
-          <w:color w:val="0096FF"/>
-        </w:rPr>
+      </w:pPr>
+      <w:bookmarkStart w:id="0" w:name="_Toc614912"/>
+      <w:r>
         <w:lastRenderedPageBreak/>
         <w:t>Notice</w:t>
       </w:r>
@@ -3796,7 +3855,7 @@
       <w:pPr>
         <w:pStyle w:val="Heading1"/>
       </w:pPr>
-      <w:bookmarkStart w:id="1" w:name="_Toc612396"/>
+      <w:bookmarkStart w:id="1" w:name="_Toc614913"/>
       <w:r>
         <w:t>Overview of RapidsSE</w:t>
       </w:r>
@@ -3806,14 +3865,14 @@
       <w:pPr>
         <w:pStyle w:val="Heading2"/>
       </w:pPr>
-      <w:bookmarkStart w:id="2" w:name="_Toc612397"/>
-      <w:r>
-        <w:t>Preliminary Statement</w:t>
-      </w:r>
-      <w:r>
-        <w:t>s</w:t>
+      <w:bookmarkStart w:id="2" w:name="_Toc614914"/>
+      <w:r>
+        <w:t xml:space="preserve">Preliminary </w:t>
       </w:r>
       <w:bookmarkEnd w:id="2"/>
+      <w:r>
+        <w:t>Remarks</w:t>
+      </w:r>
     </w:p>
     <w:p>
       <w:r>
@@ -3914,7 +3973,6 @@
       </w:r>
     </w:p>
     <w:p>
-      <w:bookmarkStart w:id="3" w:name="_Toc612398"/>
       <w:r>
         <w:t>This is a working document and will require on-going extension and correction.</w:t>
       </w:r>
@@ -3923,6 +3981,7 @@
       <w:pPr>
         <w:pStyle w:val="Heading2"/>
       </w:pPr>
+      <w:bookmarkStart w:id="3" w:name="_Toc614915"/>
       <w:r>
         <w:t>Discussion</w:t>
       </w:r>
@@ -3961,7 +4020,7 @@
       <w:pPr>
         <w:pStyle w:val="Heading2"/>
       </w:pPr>
-      <w:bookmarkStart w:id="4" w:name="_Toc612399"/>
+      <w:bookmarkStart w:id="4" w:name="_Toc614916"/>
       <w:r>
         <w:t>Key Features</w:t>
       </w:r>
@@ -4090,7 +4149,7 @@
       <w:pPr>
         <w:pStyle w:val="Heading2"/>
       </w:pPr>
-      <w:bookmarkStart w:id="5" w:name="_Toc612400"/>
+      <w:bookmarkStart w:id="5" w:name="_Toc614917"/>
       <w:r>
         <w:t>Installation</w:t>
       </w:r>
@@ -4143,7 +4202,7 @@
       <w:pPr>
         <w:pStyle w:val="Heading2"/>
       </w:pPr>
-      <w:bookmarkStart w:id="6" w:name="_Toc612401"/>
+      <w:bookmarkStart w:id="6" w:name="_Toc614918"/>
       <w:r>
         <w:lastRenderedPageBreak/>
         <w:t>Structure</w:t>
@@ -6134,7 +6193,7 @@
       <w:pPr>
         <w:pStyle w:val="Heading1"/>
       </w:pPr>
-      <w:bookmarkStart w:id="7" w:name="_Toc612402"/>
+      <w:bookmarkStart w:id="7" w:name="_Toc614919"/>
       <w:r>
         <w:lastRenderedPageBreak/>
         <w:t xml:space="preserve">Summarising: </w:t>
@@ -6165,7 +6224,7 @@
       <w:pPr>
         <w:pStyle w:val="Heading2"/>
       </w:pPr>
-      <w:bookmarkStart w:id="8" w:name="_Toc612403"/>
+      <w:bookmarkStart w:id="8" w:name="_Toc614920"/>
       <w:r>
         <w:t>Starting a RapidsSE Instance</w:t>
       </w:r>
@@ -6274,23 +6333,15 @@
           <w:sz w:val="16"/>
           <w:szCs w:val="16"/>
         </w:rPr>
-        <w:t xml:space="preserve"> </w:t>
-      </w:r>
+        <w:t xml:space="preserve"> --</w:t>
+      </w:r>
+      <w:proofErr w:type="spellStart"/>
       <w:r>
         <w:rPr>
           <w:color w:val="0070C0"/>
           <w:sz w:val="16"/>
           <w:szCs w:val="16"/>
         </w:rPr>
-        <w:t>--</w:t>
-      </w:r>
-      <w:proofErr w:type="spellStart"/>
-      <w:r>
-        <w:rPr>
-          <w:color w:val="0070C0"/>
-          <w:sz w:val="16"/>
-          <w:szCs w:val="16"/>
-        </w:rPr>
         <w:t>killPrev</w:t>
       </w:r>
       <w:proofErr w:type="spellEnd"/>
@@ -6307,7 +6358,7 @@
       <w:pPr>
         <w:pStyle w:val="Heading2"/>
       </w:pPr>
-      <w:bookmarkStart w:id="9" w:name="_Toc612404"/>
+      <w:bookmarkStart w:id="9" w:name="_Toc614921"/>
       <w:r>
         <w:t xml:space="preserve">Using the </w:t>
       </w:r>
@@ -6403,7 +6454,6 @@
           <w:lang w:val="en-US"/>
         </w:rPr>
       </w:pPr>
-      <w:bookmarkStart w:id="10" w:name="_Toc612405"/>
       <w:r>
         <w:rPr>
           <w:lang w:val="en-US"/>
@@ -6588,16 +6638,14 @@
     </w:p>
     <w:p>
       <w:r>
-        <w:t>This is useful while becoming familiar with RapidsSE</w:t>
-      </w:r>
-      <w:r>
-        <w:t>.</w:t>
+        <w:t>This is useful while becoming familiar with RapidsSE.</w:t>
       </w:r>
     </w:p>
     <w:p>
       <w:pPr>
         <w:pStyle w:val="Heading2"/>
       </w:pPr>
+      <w:bookmarkStart w:id="10" w:name="_Toc614922"/>
       <w:r>
         <w:t>Starting a RapidsSE Cluster</w:t>
       </w:r>
@@ -6668,7 +6716,6 @@
       </w:r>
     </w:p>
     <w:p>
-      <w:bookmarkStart w:id="11" w:name="_Toc612406"/>
       <w:r>
         <w:t>Starting the cluster causes all the nodes to interconnect and identify themselves.</w:t>
       </w:r>
@@ -6783,7 +6830,7 @@
           <w:sz w:val="18"/>
           <w:szCs w:val="18"/>
         </w:rPr>
-        <w:t xml:space="preserve">     </w:t>
+        <w:t xml:space="preserve">     --</w:t>
       </w:r>
       <w:r>
         <w:rPr>
@@ -6791,33 +6838,33 @@
           <w:sz w:val="18"/>
           <w:szCs w:val="18"/>
         </w:rPr>
-        <w:t>--</w:t>
-      </w:r>
-      <w:r>
+        <w:t>node NODE1 127.0.0.1 5441</w:t>
+      </w:r>
+    </w:p>
+    <w:p>
+      <w:pPr>
+        <w:pStyle w:val="ShellCode"/>
         <w:rPr>
           <w:color w:val="0070C0"/>
           <w:sz w:val="18"/>
           <w:szCs w:val="18"/>
         </w:rPr>
-        <w:t>node NODE1 127.0.0.1 5441</w:t>
-      </w:r>
-    </w:p>
-    <w:p>
-      <w:pPr>
-        <w:pStyle w:val="ShellCode"/>
+      </w:pPr>
+      <w:r>
         <w:rPr>
           <w:color w:val="0070C0"/>
           <w:sz w:val="18"/>
           <w:szCs w:val="18"/>
         </w:rPr>
-      </w:pPr>
+        <w:t xml:space="preserve">     --</w:t>
+      </w:r>
       <w:r>
         <w:rPr>
           <w:color w:val="0070C0"/>
           <w:sz w:val="18"/>
           <w:szCs w:val="18"/>
         </w:rPr>
-        <w:t xml:space="preserve">     --</w:t>
+        <w:t>node NODE</w:t>
       </w:r>
       <w:r>
         <w:rPr>
@@ -6825,7 +6872,7 @@
           <w:sz w:val="18"/>
           <w:szCs w:val="18"/>
         </w:rPr>
-        <w:t>node NODE</w:t>
+        <w:t>2</w:t>
       </w:r>
       <w:r>
         <w:rPr>
@@ -6833,7 +6880,7 @@
           <w:sz w:val="18"/>
           <w:szCs w:val="18"/>
         </w:rPr>
-        <w:t>2</w:t>
+        <w:t xml:space="preserve"> 127.0.0.1 544</w:t>
       </w:r>
       <w:r>
         <w:rPr>
@@ -6841,33 +6888,33 @@
           <w:sz w:val="18"/>
           <w:szCs w:val="18"/>
         </w:rPr>
-        <w:t xml:space="preserve"> 127.0.0.1 544</w:t>
-      </w:r>
-      <w:r>
+        <w:t>2</w:t>
+      </w:r>
+    </w:p>
+    <w:p>
+      <w:pPr>
+        <w:pStyle w:val="ShellCode"/>
         <w:rPr>
           <w:color w:val="0070C0"/>
           <w:sz w:val="18"/>
           <w:szCs w:val="18"/>
         </w:rPr>
-        <w:t>2</w:t>
-      </w:r>
-    </w:p>
-    <w:p>
-      <w:pPr>
-        <w:pStyle w:val="ShellCode"/>
+      </w:pPr>
+      <w:r>
         <w:rPr>
           <w:color w:val="0070C0"/>
           <w:sz w:val="18"/>
           <w:szCs w:val="18"/>
         </w:rPr>
-      </w:pPr>
+        <w:t xml:space="preserve">     --</w:t>
+      </w:r>
       <w:r>
         <w:rPr>
           <w:color w:val="0070C0"/>
           <w:sz w:val="18"/>
           <w:szCs w:val="18"/>
         </w:rPr>
-        <w:t xml:space="preserve">     --</w:t>
+        <w:t>node NODE</w:t>
       </w:r>
       <w:r>
         <w:rPr>
@@ -6875,7 +6922,7 @@
           <w:sz w:val="18"/>
           <w:szCs w:val="18"/>
         </w:rPr>
-        <w:t>node NODE</w:t>
+        <w:t>2</w:t>
       </w:r>
       <w:r>
         <w:rPr>
@@ -6883,7 +6930,7 @@
           <w:sz w:val="18"/>
           <w:szCs w:val="18"/>
         </w:rPr>
-        <w:t>2</w:t>
+        <w:t xml:space="preserve"> 127.0.0.1 544</w:t>
       </w:r>
       <w:r>
         <w:rPr>
@@ -6891,14 +6938,6 @@
           <w:sz w:val="18"/>
           <w:szCs w:val="18"/>
         </w:rPr>
-        <w:t xml:space="preserve"> 127.0.0.1 544</w:t>
-      </w:r>
-      <w:r>
-        <w:rPr>
-          <w:color w:val="0070C0"/>
-          <w:sz w:val="18"/>
-          <w:szCs w:val="18"/>
-        </w:rPr>
         <w:t>3</w:t>
       </w:r>
     </w:p>
@@ -6911,6 +6950,7 @@
       <w:pPr>
         <w:pStyle w:val="Heading2"/>
       </w:pPr>
+      <w:bookmarkStart w:id="11" w:name="_Toc614923"/>
       <w:r>
         <w:t>Stopping RapidsSE</w:t>
       </w:r>
@@ -6982,7 +7022,6 @@
           <w:szCs w:val="26"/>
         </w:rPr>
       </w:pPr>
-      <w:bookmarkStart w:id="12" w:name="_Toc612407"/>
       <w:r>
         <w:br w:type="page"/>
       </w:r>
@@ -6991,6 +7030,7 @@
       <w:pPr>
         <w:pStyle w:val="Heading2"/>
       </w:pPr>
+      <w:bookmarkStart w:id="12" w:name="_Toc614924"/>
       <w:r>
         <w:lastRenderedPageBreak/>
         <w:t>Important Notes</w:t>
@@ -7082,7 +7122,7 @@
       <w:pPr>
         <w:pStyle w:val="Heading1"/>
       </w:pPr>
-      <w:bookmarkStart w:id="13" w:name="_Toc612408"/>
+      <w:bookmarkStart w:id="13" w:name="_Toc614925"/>
       <w:r>
         <w:lastRenderedPageBreak/>
         <w:t xml:space="preserve">Prompt </w:t>
@@ -7101,7 +7141,7 @@
       <w:pPr>
         <w:pStyle w:val="Heading2"/>
       </w:pPr>
-      <w:bookmarkStart w:id="14" w:name="_Toc612409"/>
+      <w:bookmarkStart w:id="14" w:name="_Toc614926"/>
       <w:r>
         <w:t>Print Current Version</w:t>
       </w:r>
@@ -7180,7 +7220,7 @@
       <w:pPr>
         <w:pStyle w:val="Heading2"/>
       </w:pPr>
-      <w:bookmarkStart w:id="15" w:name="_Toc612410"/>
+      <w:bookmarkStart w:id="15" w:name="_Toc614927"/>
       <w:r>
         <w:t>Print Arguments</w:t>
       </w:r>
@@ -7405,7 +7445,7 @@
       <w:pPr>
         <w:pStyle w:val="Heading2"/>
       </w:pPr>
-      <w:bookmarkStart w:id="16" w:name="_Toc612411"/>
+      <w:bookmarkStart w:id="16" w:name="_Toc614928"/>
       <w:r>
         <w:t>Print Working Directory</w:t>
       </w:r>
@@ -7512,7 +7552,7 @@
       <w:pPr>
         <w:pStyle w:val="Heading2"/>
       </w:pPr>
-      <w:bookmarkStart w:id="17" w:name="_Toc612412"/>
+      <w:bookmarkStart w:id="17" w:name="_Toc614929"/>
       <w:r>
         <w:t>Changing Working Directory</w:t>
       </w:r>
@@ -7587,7 +7627,7 @@
       <w:pPr>
         <w:pStyle w:val="Heading2"/>
       </w:pPr>
-      <w:bookmarkStart w:id="18" w:name="_Toc612413"/>
+      <w:bookmarkStart w:id="18" w:name="_Toc614930"/>
       <w:r>
         <w:t>Listing Contents of Working Directory</w:t>
       </w:r>
@@ -7767,7 +7807,7 @@
       <w:pPr>
         <w:pStyle w:val="Heading2"/>
       </w:pPr>
-      <w:bookmarkStart w:id="19" w:name="_Toc612414"/>
+      <w:bookmarkStart w:id="19" w:name="_Toc614931"/>
       <w:r>
         <w:lastRenderedPageBreak/>
         <w:t>Print Working Folder</w:t>
@@ -7918,7 +7958,7 @@
       <w:pPr>
         <w:pStyle w:val="Heading2"/>
       </w:pPr>
-      <w:bookmarkStart w:id="20" w:name="_Toc612415"/>
+      <w:bookmarkStart w:id="20" w:name="_Toc614932"/>
       <w:r>
         <w:t>Change Working Folder</w:t>
       </w:r>
@@ -8223,7 +8263,7 @@
       <w:pPr>
         <w:pStyle w:val="Heading2"/>
       </w:pPr>
-      <w:bookmarkStart w:id="21" w:name="_Toc612416"/>
+      <w:bookmarkStart w:id="21" w:name="_Toc614933"/>
       <w:r>
         <w:t xml:space="preserve">Starting the </w:t>
       </w:r>
@@ -8315,7 +8355,7 @@
       <w:pPr>
         <w:pStyle w:val="Heading2"/>
       </w:pPr>
-      <w:bookmarkStart w:id="22" w:name="_Toc612417"/>
+      <w:bookmarkStart w:id="22" w:name="_Toc614934"/>
       <w:r>
         <w:t>Getting the Cluster Status</w:t>
       </w:r>
@@ -8424,7 +8464,7 @@
       <w:pPr>
         <w:pStyle w:val="Heading2"/>
       </w:pPr>
-      <w:bookmarkStart w:id="23" w:name="_Toc612418"/>
+      <w:bookmarkStart w:id="23" w:name="_Toc614935"/>
       <w:r>
         <w:t>Space Usage</w:t>
       </w:r>
@@ -8527,7 +8567,7 @@
       <w:pPr>
         <w:pStyle w:val="Heading2"/>
       </w:pPr>
-      <w:bookmarkStart w:id="24" w:name="_Toc612419"/>
+      <w:bookmarkStart w:id="24" w:name="_Toc614936"/>
       <w:r>
         <w:t>Create a table</w:t>
       </w:r>
@@ -8777,7 +8817,7 @@
       <w:pPr>
         <w:pStyle w:val="Heading2"/>
       </w:pPr>
-      <w:bookmarkStart w:id="25" w:name="_Toc612420"/>
+      <w:bookmarkStart w:id="25" w:name="_Toc614937"/>
       <w:r>
         <w:t>Listing Tables</w:t>
       </w:r>
@@ -8884,7 +8924,7 @@
       <w:pPr>
         <w:pStyle w:val="Heading2"/>
       </w:pPr>
-      <w:bookmarkStart w:id="26" w:name="_Toc612421"/>
+      <w:bookmarkStart w:id="26" w:name="_Toc614938"/>
       <w:r>
         <w:t>Listing Columns</w:t>
       </w:r>
@@ -9051,7 +9091,7 @@
       <w:pPr>
         <w:pStyle w:val="Heading2"/>
       </w:pPr>
-      <w:bookmarkStart w:id="27" w:name="_Toc612422"/>
+      <w:bookmarkStart w:id="27" w:name="_Toc614939"/>
       <w:r>
         <w:t>Creating an Index</w:t>
       </w:r>
@@ -9139,7 +9179,7 @@
       <w:pPr>
         <w:pStyle w:val="Heading2"/>
       </w:pPr>
-      <w:bookmarkStart w:id="28" w:name="_Toc612423"/>
+      <w:bookmarkStart w:id="28" w:name="_Toc614940"/>
       <w:r>
         <w:t>Listing Indexes</w:t>
       </w:r>
@@ -9258,7 +9298,7 @@
       <w:pPr>
         <w:pStyle w:val="Heading2"/>
       </w:pPr>
-      <w:bookmarkStart w:id="29" w:name="_Toc612424"/>
+      <w:bookmarkStart w:id="29" w:name="_Toc614941"/>
       <w:r>
         <w:t>Listing Index Columns</w:t>
       </w:r>
@@ -9372,7 +9412,7 @@
       <w:pPr>
         <w:pStyle w:val="Heading2"/>
       </w:pPr>
-      <w:bookmarkStart w:id="30" w:name="_Toc612425"/>
+      <w:bookmarkStart w:id="30" w:name="_Toc614942"/>
       <w:r>
         <w:t>Loading a Table</w:t>
       </w:r>
@@ -9498,7 +9538,7 @@
       <w:pPr>
         <w:pStyle w:val="Heading2"/>
       </w:pPr>
-      <w:bookmarkStart w:id="31" w:name="_Toc612426"/>
+      <w:bookmarkStart w:id="31" w:name="_Toc614943"/>
       <w:r>
         <w:t>Size of Table</w:t>
       </w:r>
@@ -9541,37 +9581,152 @@
         </w:rPr>
         <w:t xml:space="preserve">se&gt; </w:t>
       </w:r>
+      <w:r>
+        <w:rPr>
+          <w:lang w:val="en-US"/>
+        </w:rPr>
+        <w:t>sz nation;</w:t>
+      </w:r>
+    </w:p>
+    <w:p>
+      <w:pPr>
+        <w:pStyle w:val="SePrompt"/>
+        <w:rPr>
+          <w:b/>
+          <w:bCs/>
+          <w:lang w:val="en-US"/>
+        </w:rPr>
+      </w:pPr>
+      <w:r>
+        <w:rPr>
+          <w:b/>
+          <w:bCs/>
+          <w:lang w:val="en-US"/>
+        </w:rPr>
+        <w:t>row: ( NODE1 4MB )</w:t>
+      </w:r>
+    </w:p>
+    <w:p>
+      <w:pPr>
+        <w:pStyle w:val="SePrompt"/>
+        <w:rPr>
+          <w:b/>
+          <w:bCs/>
+          <w:lang w:val="en-US"/>
+        </w:rPr>
+      </w:pPr>
+      <w:r>
+        <w:rPr>
+          <w:b/>
+          <w:bCs/>
+          <w:lang w:val="en-US"/>
+        </w:rPr>
+        <w:t>success: 1 rows affected</w:t>
+      </w:r>
+    </w:p>
+    <w:p>
+      <w:pPr>
+        <w:pStyle w:val="SePrompt"/>
+        <w:rPr>
+          <w:b/>
+          <w:bCs/>
+          <w:lang w:val="en-US"/>
+        </w:rPr>
+      </w:pPr>
+      <w:r>
+        <w:rPr>
+          <w:b/>
+          <w:bCs/>
+          <w:lang w:val="en-US"/>
+        </w:rPr>
+        <w:t>se&gt;</w:t>
+      </w:r>
+    </w:p>
+    <w:p>
+      <w:r>
+        <w:t>Please note that internally RapidsSE uses buffers in shared memory to hold data.  Such buffers are 1MB in size.  By default RapidsSE starts with 4 partitions per node.  So in this example there is one buffer per partition for the table nation.</w:t>
+      </w:r>
+    </w:p>
+    <w:p>
+      <w:pPr>
+        <w:pStyle w:val="Heading2"/>
+      </w:pPr>
+      <w:bookmarkStart w:id="32" w:name="_Toc614944"/>
+      <w:r>
+        <w:t>Size of Index</w:t>
+      </w:r>
+      <w:bookmarkEnd w:id="32"/>
+    </w:p>
+    <w:p>
+      <w:pPr>
+        <w:rPr>
+          <w:color w:val="C00000"/>
+        </w:rPr>
+      </w:pPr>
+      <w:r>
+        <w:t xml:space="preserve">To </w:t>
+      </w:r>
+      <w:r>
+        <w:t>get the size of an index</w:t>
+      </w:r>
+      <w:r>
+        <w:t xml:space="preserve"> use: </w:t>
+      </w:r>
       <w:proofErr w:type="spellStart"/>
       <w:r>
         <w:rPr>
-          <w:lang w:val="en-US"/>
-        </w:rPr>
-        <w:t>sz</w:t>
+          <w:color w:val="C00000"/>
+        </w:rPr>
+        <w:t>szidx</w:t>
       </w:r>
       <w:proofErr w:type="spellEnd"/>
-      <w:r>
-        <w:rPr>
-          <w:lang w:val="en-US"/>
-        </w:rPr>
-        <w:t xml:space="preserve"> nation;</w:t>
-      </w:r>
-    </w:p>
-    <w:p>
-      <w:pPr>
-        <w:pStyle w:val="SePrompt"/>
-        <w:rPr>
-          <w:b/>
-          <w:bCs/>
-          <w:lang w:val="en-US"/>
-        </w:rPr>
-      </w:pPr>
-      <w:r>
-        <w:rPr>
-          <w:b/>
-          <w:bCs/>
-          <w:lang w:val="en-US"/>
-        </w:rPr>
-        <w:t>row: ( NODE1 4MB )</w:t>
+    </w:p>
+    <w:p>
+      <w:pPr>
+        <w:pStyle w:val="SePrompt"/>
+        <w:rPr>
+          <w:lang w:val="en-US"/>
+        </w:rPr>
+      </w:pPr>
+      <w:r>
+        <w:rPr>
+          <w:b/>
+          <w:bCs/>
+          <w:lang w:val="en-US"/>
+        </w:rPr>
+        <w:t xml:space="preserve">se&gt; </w:t>
+      </w:r>
+      <w:proofErr w:type="spellStart"/>
+      <w:r>
+        <w:rPr>
+          <w:lang w:val="en-US"/>
+        </w:rPr>
+        <w:t>szidx</w:t>
+      </w:r>
+      <w:proofErr w:type="spellEnd"/>
+      <w:r>
+        <w:rPr>
+          <w:lang w:val="en-US"/>
+        </w:rPr>
+        <w:t xml:space="preserve"> nation nation_idx1;</w:t>
+      </w:r>
+    </w:p>
+    <w:p>
+      <w:pPr>
+        <w:pStyle w:val="SePrompt"/>
+        <w:rPr>
+          <w:b/>
+          <w:bCs/>
+          <w:lang w:val="en-US"/>
+        </w:rPr>
+      </w:pPr>
+      <w:r>
+        <w:rPr>
+          <w:b/>
+          <w:bCs/>
+          <w:lang w:val="en-US"/>
+        </w:rPr>
+        <w:t>row: ('NODE1' 4MB)</w:t>
       </w:r>
     </w:p>
     <w:p>
@@ -9595,11 +9750,6 @@
     <w:p>
       <w:pPr>
         <w:pStyle w:val="SePrompt"/>
-        <w:rPr>
-          <w:b/>
-          <w:bCs/>
-          <w:lang w:val="en-US"/>
-        </w:rPr>
       </w:pPr>
       <w:r>
         <w:rPr>
@@ -9612,18 +9762,18 @@
     </w:p>
     <w:p>
       <w:r>
-        <w:t>Please note that internally RapidsSE uses buffers in shared memory to hold data.  Such buffers are 1MB in size.  By default RapidsSE starts with 4 partitions per node.  So in this example there is one buffer per partition for the table nation.</w:t>
+        <w:t>Please note that internally RapidsSE uses buffers in shared memory to hold data.  Such buffers are 1MB in size.  By default RapidsSE starts with 4 partitions per node.  So in this example there is one buffer per partition for the index.</w:t>
       </w:r>
     </w:p>
     <w:p>
       <w:pPr>
         <w:pStyle w:val="Heading2"/>
       </w:pPr>
-      <w:bookmarkStart w:id="32" w:name="_Toc612427"/>
-      <w:r>
-        <w:t>Size of Index</w:t>
-      </w:r>
-      <w:bookmarkEnd w:id="32"/>
+      <w:bookmarkStart w:id="33" w:name="_Toc614945"/>
+      <w:r>
+        <w:t>Table Sizes</w:t>
+      </w:r>
+      <w:bookmarkEnd w:id="33"/>
     </w:p>
     <w:p>
       <w:pPr>
@@ -9635,7 +9785,7 @@
         <w:t xml:space="preserve">To </w:t>
       </w:r>
       <w:r>
-        <w:t>get the size of an index</w:t>
+        <w:t>get the sizes of all tables in current folder</w:t>
       </w:r>
       <w:r>
         <w:t xml:space="preserve"> use: </w:t>
@@ -9645,7 +9795,7 @@
         <w:rPr>
           <w:color w:val="C00000"/>
         </w:rPr>
-        <w:t>szidx</w:t>
+        <w:t>tableSizes</w:t>
       </w:r>
       <w:proofErr w:type="spellEnd"/>
     </w:p>
@@ -9669,32 +9819,32 @@
         <w:rPr>
           <w:lang w:val="en-US"/>
         </w:rPr>
-        <w:t>szidx</w:t>
+        <w:t>tablesizes</w:t>
       </w:r>
       <w:proofErr w:type="spellEnd"/>
       <w:r>
         <w:rPr>
           <w:lang w:val="en-US"/>
         </w:rPr>
-        <w:t xml:space="preserve"> nation nation_idx1;</w:t>
-      </w:r>
-    </w:p>
-    <w:p>
-      <w:pPr>
-        <w:pStyle w:val="SePrompt"/>
-        <w:rPr>
-          <w:b/>
-          <w:bCs/>
-          <w:lang w:val="en-US"/>
-        </w:rPr>
-      </w:pPr>
-      <w:r>
-        <w:rPr>
-          <w:b/>
-          <w:bCs/>
-          <w:lang w:val="en-US"/>
-        </w:rPr>
-        <w:t>row: ('NODE1' 4MB)</w:t>
+        <w:t>;</w:t>
+      </w:r>
+    </w:p>
+    <w:p>
+      <w:pPr>
+        <w:pStyle w:val="SePrompt"/>
+        <w:rPr>
+          <w:b/>
+          <w:bCs/>
+          <w:lang w:val="en-US"/>
+        </w:rPr>
+      </w:pPr>
+      <w:r>
+        <w:rPr>
+          <w:b/>
+          <w:bCs/>
+          <w:lang w:val="en-US"/>
+        </w:rPr>
+        <w:t>row: ('NODE1', 'nation', '4MB')</w:t>
       </w:r>
     </w:p>
     <w:p>
@@ -9729,128 +9879,10 @@
       </w:r>
     </w:p>
     <w:p>
-      <w:r>
-        <w:t>Please note that internally RapidsSE uses buffers in shared memory to hold data.  Such buffers are 1MB in size.  By default RapidsSE starts with 4 partitions per node.  So in this example there is one buffer per partition for the index.</w:t>
-      </w:r>
-    </w:p>
-    <w:p>
       <w:pPr>
         <w:pStyle w:val="Heading2"/>
       </w:pPr>
-      <w:bookmarkStart w:id="33" w:name="_Toc612428"/>
-      <w:r>
-        <w:t>Table Sizes</w:t>
-      </w:r>
-      <w:bookmarkEnd w:id="33"/>
-    </w:p>
-    <w:p>
-      <w:pPr>
-        <w:rPr>
-          <w:color w:val="C00000"/>
-        </w:rPr>
-      </w:pPr>
-      <w:r>
-        <w:t xml:space="preserve">To </w:t>
-      </w:r>
-      <w:r>
-        <w:t>get the sizes of all tables in current folder</w:t>
-      </w:r>
-      <w:r>
-        <w:t xml:space="preserve"> use: </w:t>
-      </w:r>
-      <w:proofErr w:type="spellStart"/>
-      <w:r>
-        <w:rPr>
-          <w:color w:val="C00000"/>
-        </w:rPr>
-        <w:t>tableSizes</w:t>
-      </w:r>
-      <w:proofErr w:type="spellEnd"/>
-    </w:p>
-    <w:p>
-      <w:pPr>
-        <w:pStyle w:val="SePrompt"/>
-        <w:rPr>
-          <w:lang w:val="en-US"/>
-        </w:rPr>
-      </w:pPr>
-      <w:r>
-        <w:rPr>
-          <w:b/>
-          <w:bCs/>
-          <w:lang w:val="en-US"/>
-        </w:rPr>
-        <w:t xml:space="preserve">se&gt; </w:t>
-      </w:r>
-      <w:proofErr w:type="spellStart"/>
-      <w:r>
-        <w:rPr>
-          <w:lang w:val="en-US"/>
-        </w:rPr>
-        <w:t>tablesizes</w:t>
-      </w:r>
-      <w:proofErr w:type="spellEnd"/>
-      <w:r>
-        <w:rPr>
-          <w:lang w:val="en-US"/>
-        </w:rPr>
-        <w:t>;</w:t>
-      </w:r>
-    </w:p>
-    <w:p>
-      <w:pPr>
-        <w:pStyle w:val="SePrompt"/>
-        <w:rPr>
-          <w:b/>
-          <w:bCs/>
-          <w:lang w:val="en-US"/>
-        </w:rPr>
-      </w:pPr>
-      <w:r>
-        <w:rPr>
-          <w:b/>
-          <w:bCs/>
-          <w:lang w:val="en-US"/>
-        </w:rPr>
-        <w:t>row: ('NODE1', 'nation', '4MB')</w:t>
-      </w:r>
-    </w:p>
-    <w:p>
-      <w:pPr>
-        <w:pStyle w:val="SePrompt"/>
-        <w:rPr>
-          <w:b/>
-          <w:bCs/>
-          <w:lang w:val="en-US"/>
-        </w:rPr>
-      </w:pPr>
-      <w:r>
-        <w:rPr>
-          <w:b/>
-          <w:bCs/>
-          <w:lang w:val="en-US"/>
-        </w:rPr>
-        <w:t>success: 1 rows affected</w:t>
-      </w:r>
-    </w:p>
-    <w:p>
-      <w:pPr>
-        <w:pStyle w:val="SePrompt"/>
-      </w:pPr>
-      <w:r>
-        <w:rPr>
-          <w:b/>
-          <w:bCs/>
-          <w:lang w:val="en-US"/>
-        </w:rPr>
-        <w:t>se&gt;</w:t>
-      </w:r>
-    </w:p>
-    <w:p>
-      <w:pPr>
-        <w:pStyle w:val="Heading2"/>
-      </w:pPr>
-      <w:bookmarkStart w:id="34" w:name="_Toc612429"/>
+      <w:bookmarkStart w:id="34" w:name="_Toc614946"/>
       <w:r>
         <w:t>Fetching Rows</w:t>
       </w:r>
@@ -10744,7 +10776,7 @@
       <w:pPr>
         <w:pStyle w:val="Heading2"/>
       </w:pPr>
-      <w:bookmarkStart w:id="35" w:name="_Toc612430"/>
+      <w:bookmarkStart w:id="35" w:name="_Toc614947"/>
       <w:r>
         <w:t>Listing Contents of Working Folder</w:t>
       </w:r>
@@ -11406,7 +11438,7 @@
       <w:pPr>
         <w:pStyle w:val="Heading2"/>
       </w:pPr>
-      <w:bookmarkStart w:id="36" w:name="_Toc612431"/>
+      <w:bookmarkStart w:id="36" w:name="_Toc614948"/>
       <w:r>
         <w:t>Exporting a Table</w:t>
       </w:r>
@@ -11451,7 +11483,7 @@
       <w:pPr>
         <w:pStyle w:val="Heading2"/>
       </w:pPr>
-      <w:bookmarkStart w:id="37" w:name="_Toc612432"/>
+      <w:bookmarkStart w:id="37" w:name="_Toc614949"/>
       <w:r>
         <w:t>Truncating a Table</w:t>
       </w:r>
@@ -11613,7 +11645,7 @@
       <w:pPr>
         <w:pStyle w:val="Heading2"/>
       </w:pPr>
-      <w:bookmarkStart w:id="38" w:name="_Toc612433"/>
+      <w:bookmarkStart w:id="38" w:name="_Toc614950"/>
       <w:r>
         <w:t>Dropping an Index</w:t>
       </w:r>
@@ -11704,7 +11736,7 @@
       <w:pPr>
         <w:pStyle w:val="Heading2"/>
       </w:pPr>
-      <w:bookmarkStart w:id="39" w:name="_Toc612434"/>
+      <w:bookmarkStart w:id="39" w:name="_Toc614951"/>
       <w:r>
         <w:t>Dropping a Table</w:t>
       </w:r>
@@ -11791,268 +11823,124 @@
         <w:t>se&gt;</w:t>
       </w:r>
     </w:p>
-    <w:p/>
-    <w:p>
-      <w:pPr>
-        <w:rPr>
-          <w:rFonts w:asciiTheme="majorHAnsi" w:eastAsiaTheme="majorEastAsia" w:hAnsiTheme="majorHAnsi" w:cstheme="majorBidi"/>
-          <w:color w:val="2F5496" w:themeColor="accent1" w:themeShade="BF"/>
-          <w:sz w:val="32"/>
-          <w:szCs w:val="32"/>
-        </w:rPr>
-      </w:pPr>
-      <w:r>
-        <w:br w:type="page"/>
-      </w:r>
-    </w:p>
-    <w:p>
-      <w:pPr>
-        <w:pStyle w:val="Heading1"/>
-      </w:pPr>
-      <w:bookmarkStart w:id="40" w:name="_Toc612435"/>
-      <w:r>
-        <w:lastRenderedPageBreak/>
-        <w:t xml:space="preserve">Supported </w:t>
-      </w:r>
-      <w:r>
-        <w:t>Column</w:t>
-      </w:r>
-      <w:r>
-        <w:t xml:space="preserve"> Types</w:t>
+    <w:p>
+      <w:pPr>
+        <w:pStyle w:val="Heading2"/>
+      </w:pPr>
+      <w:bookmarkStart w:id="40" w:name="_Toc614952"/>
+      <w:r>
+        <w:t>Timing Commands</w:t>
       </w:r>
       <w:bookmarkEnd w:id="40"/>
     </w:p>
     <w:p>
       <w:r>
-        <w:t xml:space="preserve">RapidsSE supports the following </w:t>
-      </w:r>
-      <w:r>
-        <w:t xml:space="preserve">column </w:t>
-      </w:r>
-      <w:r>
-        <w:t>data types.</w:t>
-      </w:r>
-    </w:p>
-    <w:p/>
-    <w:tbl>
-      <w:tblPr>
-        <w:tblStyle w:val="TableGrid"/>
-        <w:tblW w:w="0" w:type="auto"/>
-        <w:tblLook w:val="04A0" w:firstRow="1" w:lastRow="0" w:firstColumn="1" w:lastColumn="0" w:noHBand="0" w:noVBand="1"/>
-      </w:tblPr>
-      <w:tblGrid>
-        <w:gridCol w:w="2263"/>
-        <w:gridCol w:w="6747"/>
-      </w:tblGrid>
-      <w:tr>
-        <w:tc>
-          <w:tcPr>
-            <w:tcW w:w="2263" w:type="dxa"/>
-            <w:shd w:val="clear" w:color="auto" w:fill="D9D9D9" w:themeFill="background1" w:themeFillShade="D9"/>
-          </w:tcPr>
-          <w:p>
-            <w:r>
-              <w:t>Column</w:t>
-            </w:r>
-            <w:r>
-              <w:t xml:space="preserve"> Type</w:t>
-            </w:r>
-          </w:p>
-        </w:tc>
-        <w:tc>
-          <w:tcPr>
-            <w:tcW w:w="6747" w:type="dxa"/>
-            <w:shd w:val="clear" w:color="auto" w:fill="D9D9D9" w:themeFill="background1" w:themeFillShade="D9"/>
-          </w:tcPr>
-          <w:p>
-            <w:r>
-              <w:t>Description</w:t>
-            </w:r>
-          </w:p>
-        </w:tc>
-      </w:tr>
-      <w:tr>
-        <w:tc>
-          <w:tcPr>
-            <w:tcW w:w="2263" w:type="dxa"/>
-          </w:tcPr>
-          <w:p>
-            <w:proofErr w:type="spellStart"/>
-            <w:r>
-              <w:t>boolean</w:t>
-            </w:r>
-            <w:proofErr w:type="spellEnd"/>
-          </w:p>
-        </w:tc>
-        <w:tc>
-          <w:tcPr>
-            <w:tcW w:w="6747" w:type="dxa"/>
-          </w:tcPr>
-          <w:p/>
-        </w:tc>
-      </w:tr>
-      <w:tr>
-        <w:tc>
-          <w:tcPr>
-            <w:tcW w:w="2263" w:type="dxa"/>
-          </w:tcPr>
-          <w:p>
-            <w:r>
-              <w:t>date</w:t>
-            </w:r>
-          </w:p>
-        </w:tc>
-        <w:tc>
-          <w:tcPr>
-            <w:tcW w:w="6747" w:type="dxa"/>
-          </w:tcPr>
-          <w:p/>
-        </w:tc>
-      </w:tr>
-      <w:tr>
-        <w:tc>
-          <w:tcPr>
-            <w:tcW w:w="2263" w:type="dxa"/>
-          </w:tcPr>
-          <w:p>
-            <w:r>
-              <w:t>decimal</w:t>
-            </w:r>
-          </w:p>
-        </w:tc>
-        <w:tc>
-          <w:tcPr>
-            <w:tcW w:w="6747" w:type="dxa"/>
-          </w:tcPr>
-          <w:p/>
-        </w:tc>
-      </w:tr>
-      <w:tr>
-        <w:tc>
-          <w:tcPr>
-            <w:tcW w:w="2263" w:type="dxa"/>
-          </w:tcPr>
-          <w:p>
-            <w:r>
-              <w:t>float</w:t>
-            </w:r>
-          </w:p>
-        </w:tc>
-        <w:tc>
-          <w:tcPr>
-            <w:tcW w:w="6747" w:type="dxa"/>
-          </w:tcPr>
-          <w:p/>
-        </w:tc>
-      </w:tr>
-      <w:tr>
-        <w:tc>
-          <w:tcPr>
-            <w:tcW w:w="2263" w:type="dxa"/>
-          </w:tcPr>
-          <w:p>
-            <w:r>
-              <w:t>integer</w:t>
-            </w:r>
-          </w:p>
-        </w:tc>
-        <w:tc>
-          <w:tcPr>
-            <w:tcW w:w="6747" w:type="dxa"/>
-          </w:tcPr>
-          <w:p/>
-        </w:tc>
-      </w:tr>
-      <w:tr>
-        <w:tc>
-          <w:tcPr>
-            <w:tcW w:w="2263" w:type="dxa"/>
-          </w:tcPr>
-          <w:p>
-            <w:r>
-              <w:t>interval</w:t>
-            </w:r>
-          </w:p>
-        </w:tc>
-        <w:tc>
-          <w:tcPr>
-            <w:tcW w:w="6747" w:type="dxa"/>
-          </w:tcPr>
-          <w:p/>
-        </w:tc>
-      </w:tr>
-      <w:tr>
-        <w:tc>
-          <w:tcPr>
-            <w:tcW w:w="2263" w:type="dxa"/>
-          </w:tcPr>
-          <w:p>
-            <w:r>
-              <w:t>time</w:t>
-            </w:r>
-          </w:p>
-        </w:tc>
-        <w:tc>
-          <w:tcPr>
-            <w:tcW w:w="6747" w:type="dxa"/>
-          </w:tcPr>
-          <w:p/>
-        </w:tc>
-      </w:tr>
-      <w:tr>
-        <w:tc>
-          <w:tcPr>
-            <w:tcW w:w="2263" w:type="dxa"/>
-          </w:tcPr>
-          <w:p>
-            <w:r>
-              <w:t>timestamp</w:t>
-            </w:r>
-          </w:p>
-        </w:tc>
-        <w:tc>
-          <w:tcPr>
-            <w:tcW w:w="6747" w:type="dxa"/>
-          </w:tcPr>
-          <w:p/>
-        </w:tc>
-      </w:tr>
-      <w:tr>
-        <w:tc>
-          <w:tcPr>
-            <w:tcW w:w="2263" w:type="dxa"/>
-          </w:tcPr>
-          <w:p>
-            <w:r>
-              <w:t>varchar</w:t>
-            </w:r>
-          </w:p>
-        </w:tc>
-        <w:tc>
-          <w:tcPr>
-            <w:tcW w:w="6747" w:type="dxa"/>
-          </w:tcPr>
-          <w:p/>
-        </w:tc>
-      </w:tr>
-    </w:tbl>
-    <w:p/>
-    <w:p>
-      <w:pPr>
-        <w:pStyle w:val="Heading1"/>
-      </w:pPr>
-      <w:bookmarkStart w:id="41" w:name="_Toc612436"/>
-      <w:r>
-        <w:t>Timing Commands</w:t>
+        <w:t>Commands can be timed using the ‘time’ prefix in from of commands.  For example:</w:t>
+      </w:r>
+    </w:p>
+    <w:p>
+      <w:pPr>
+        <w:pStyle w:val="SePrompt"/>
+        <w:rPr>
+          <w:lang w:val="en-US"/>
+        </w:rPr>
+      </w:pPr>
+      <w:r>
+        <w:rPr>
+          <w:b/>
+          <w:bCs/>
+          <w:lang w:val="en-US"/>
+        </w:rPr>
+        <w:t xml:space="preserve">se&gt; </w:t>
+      </w:r>
+      <w:r>
+        <w:rPr>
+          <w:lang w:val="en-US"/>
+        </w:rPr>
+        <w:t>time create index nation_idx1 ON nation(</w:t>
+      </w:r>
+      <w:proofErr w:type="spellStart"/>
+      <w:r>
+        <w:rPr>
+          <w:lang w:val="en-US"/>
+        </w:rPr>
+        <w:t>N_NationKey</w:t>
+      </w:r>
+      <w:proofErr w:type="spellEnd"/>
+      <w:r>
+        <w:rPr>
+          <w:lang w:val="en-US"/>
+        </w:rPr>
+        <w:t>);</w:t>
+      </w:r>
+    </w:p>
+    <w:p>
+      <w:pPr>
+        <w:pStyle w:val="SePrompt"/>
+        <w:rPr>
+          <w:b/>
+          <w:bCs/>
+          <w:lang w:val="en-US"/>
+        </w:rPr>
+      </w:pPr>
+      <w:r>
+        <w:rPr>
+          <w:b/>
+          <w:bCs/>
+          <w:lang w:val="en-US"/>
+        </w:rPr>
+        <w:t>success: 0 rows affected</w:t>
+      </w:r>
+    </w:p>
+    <w:p>
+      <w:pPr>
+        <w:pStyle w:val="SePrompt"/>
+        <w:rPr>
+          <w:b/>
+          <w:bCs/>
+          <w:lang w:val="en-US"/>
+        </w:rPr>
+      </w:pPr>
+      <w:r>
+        <w:rPr>
+          <w:b/>
+          <w:bCs/>
+          <w:lang w:val="en-US"/>
+        </w:rPr>
+        <w:t>time 2ms</w:t>
+      </w:r>
+    </w:p>
+    <w:p>
+      <w:pPr>
+        <w:pStyle w:val="SePrompt"/>
+      </w:pPr>
+      <w:r>
+        <w:rPr>
+          <w:b/>
+          <w:bCs/>
+          <w:lang w:val="en-US"/>
+        </w:rPr>
+        <w:t>se&gt;</w:t>
+      </w:r>
+    </w:p>
+    <w:p>
+      <w:r>
+        <w:t>In the above we can observe that the create index command took 2 milliseconds.</w:t>
+      </w:r>
+    </w:p>
+    <w:p>
+      <w:pPr>
+        <w:pStyle w:val="Heading2"/>
+      </w:pPr>
+      <w:bookmarkStart w:id="41" w:name="_Toc614953"/>
+      <w:r>
+        <w:t>Scripting</w:t>
       </w:r>
       <w:bookmarkEnd w:id="41"/>
     </w:p>
     <w:p>
       <w:r>
-        <w:t xml:space="preserve">Commands can be timed using the </w:t>
-      </w:r>
-      <w:r>
-        <w:t>‘time’ prefix in from of commands.  For example:</w:t>
+        <w:t>The RapidsSE prompt supports scripting – a series of commands can be put into a file and executed from the prompt by typing in the name of the file.</w:t>
       </w:r>
     </w:p>
     <w:p>
@@ -12074,58 +11962,16 @@
         <w:rPr>
           <w:lang w:val="en-US"/>
         </w:rPr>
-        <w:t>time create index nation_idx1 ON nation(</w:t>
+        <w:t>_</w:t>
       </w:r>
       <w:proofErr w:type="spellStart"/>
       <w:r>
         <w:rPr>
           <w:lang w:val="en-US"/>
         </w:rPr>
-        <w:t>N_NationKey</w:t>
+        <w:t>myScriptFile</w:t>
       </w:r>
       <w:proofErr w:type="spellEnd"/>
-      <w:r>
-        <w:rPr>
-          <w:lang w:val="en-US"/>
-        </w:rPr>
-        <w:t>);</w:t>
-      </w:r>
-    </w:p>
-    <w:p>
-      <w:pPr>
-        <w:pStyle w:val="SePrompt"/>
-        <w:rPr>
-          <w:b/>
-          <w:bCs/>
-          <w:lang w:val="en-US"/>
-        </w:rPr>
-      </w:pPr>
-      <w:r>
-        <w:rPr>
-          <w:b/>
-          <w:bCs/>
-          <w:lang w:val="en-US"/>
-        </w:rPr>
-        <w:t>success: 0 rows affected</w:t>
-      </w:r>
-    </w:p>
-    <w:p>
-      <w:pPr>
-        <w:pStyle w:val="SePrompt"/>
-        <w:rPr>
-          <w:b/>
-          <w:bCs/>
-          <w:lang w:val="en-US"/>
-        </w:rPr>
-      </w:pPr>
-      <w:r>
-        <w:rPr>
-          <w:b/>
-          <w:bCs/>
-          <w:lang w:val="en-US"/>
-        </w:rPr>
-        <w:t>time 2ms</w:t>
-      </w:r>
     </w:p>
     <w:p>
       <w:pPr>
@@ -12142,22 +11988,33 @@
     </w:p>
     <w:p>
       <w:r>
-        <w:t>In the above we can observe that the create index command took 2 milliseconds.</w:t>
-      </w:r>
-    </w:p>
-    <w:p>
-      <w:pPr>
-        <w:pStyle w:val="Heading1"/>
-      </w:pPr>
-      <w:bookmarkStart w:id="42" w:name="_Toc612437"/>
-      <w:r>
-        <w:t>Scripting</w:t>
-      </w:r>
-      <w:bookmarkEnd w:id="42"/>
-    </w:p>
-    <w:p>
-      <w:r>
-        <w:t>The RapidsSE prompt supports scripting – a series of commands can be put into a file and executed from the prompt by typing in the name of the file.</w:t>
+        <w:t>In the case of script file it is not necessary to terminate the command with a semicolon.</w:t>
+      </w:r>
+    </w:p>
+    <w:p>
+      <w:pPr>
+        <w:pStyle w:val="Heading3"/>
+      </w:pPr>
+      <w:r>
+        <w:t xml:space="preserve">Printing to </w:t>
+      </w:r>
+      <w:proofErr w:type="spellStart"/>
+      <w:r>
+        <w:t>Stdout</w:t>
+      </w:r>
+      <w:proofErr w:type="spellEnd"/>
+    </w:p>
+    <w:p>
+      <w:r>
+        <w:t xml:space="preserve">To print to </w:t>
+      </w:r>
+      <w:proofErr w:type="spellStart"/>
+      <w:r>
+        <w:t>stdout</w:t>
+      </w:r>
+      <w:proofErr w:type="spellEnd"/>
+      <w:r>
+        <w:t xml:space="preserve"> in a script use the print function:</w:t>
       </w:r>
     </w:p>
     <w:p>
@@ -12179,16 +12036,22 @@
         <w:rPr>
           <w:lang w:val="en-US"/>
         </w:rPr>
-        <w:t>_</w:t>
-      </w:r>
-      <w:proofErr w:type="spellStart"/>
-      <w:r>
-        <w:rPr>
-          <w:lang w:val="en-US"/>
-        </w:rPr>
-        <w:t>myScriptFile</w:t>
-      </w:r>
-      <w:proofErr w:type="spellEnd"/>
+        <w:t>print “hello”;</w:t>
+      </w:r>
+    </w:p>
+    <w:p>
+      <w:pPr>
+        <w:pStyle w:val="SePrompt"/>
+        <w:rPr>
+          <w:lang w:val="en-US"/>
+        </w:rPr>
+      </w:pPr>
+      <w:r>
+        <w:rPr>
+          <w:lang w:val="en-US"/>
+        </w:rPr>
+        <w:t>hello</w:t>
+      </w:r>
     </w:p>
     <w:p>
       <w:pPr>
@@ -12204,93 +12067,10 @@
       </w:r>
     </w:p>
     <w:p>
-      <w:r>
-        <w:t>In the case of script file it is not necessary to terminate the command with a semicolon.</w:t>
-      </w:r>
-    </w:p>
-    <w:p>
       <w:pPr>
         <w:pStyle w:val="Heading3"/>
       </w:pPr>
       <w:r>
-        <w:t>Print</w:t>
-      </w:r>
-      <w:r>
-        <w:t xml:space="preserve">ing to </w:t>
-      </w:r>
-      <w:proofErr w:type="spellStart"/>
-      <w:r>
-        <w:t>Stdout</w:t>
-      </w:r>
-      <w:proofErr w:type="spellEnd"/>
-    </w:p>
-    <w:p>
-      <w:r>
-        <w:t xml:space="preserve">To print to </w:t>
-      </w:r>
-      <w:proofErr w:type="spellStart"/>
-      <w:r>
-        <w:t>stdout</w:t>
-      </w:r>
-      <w:proofErr w:type="spellEnd"/>
-      <w:r>
-        <w:t xml:space="preserve"> in a script use the print function:</w:t>
-      </w:r>
-    </w:p>
-    <w:p>
-      <w:pPr>
-        <w:pStyle w:val="SePrompt"/>
-        <w:rPr>
-          <w:lang w:val="en-US"/>
-        </w:rPr>
-      </w:pPr>
-      <w:r>
-        <w:rPr>
-          <w:b/>
-          <w:bCs/>
-          <w:lang w:val="en-US"/>
-        </w:rPr>
-        <w:t xml:space="preserve">se&gt; </w:t>
-      </w:r>
-      <w:r>
-        <w:rPr>
-          <w:lang w:val="en-US"/>
-        </w:rPr>
-        <w:t>print “hello”;</w:t>
-      </w:r>
-    </w:p>
-    <w:p>
-      <w:pPr>
-        <w:pStyle w:val="SePrompt"/>
-        <w:rPr>
-          <w:lang w:val="en-US"/>
-        </w:rPr>
-      </w:pPr>
-      <w:r>
-        <w:rPr>
-          <w:lang w:val="en-US"/>
-        </w:rPr>
-        <w:t>hello</w:t>
-      </w:r>
-    </w:p>
-    <w:p>
-      <w:pPr>
-        <w:pStyle w:val="SePrompt"/>
-      </w:pPr>
-      <w:r>
-        <w:rPr>
-          <w:b/>
-          <w:bCs/>
-          <w:lang w:val="en-US"/>
-        </w:rPr>
-        <w:t>se&gt;</w:t>
-      </w:r>
-    </w:p>
-    <w:p>
-      <w:pPr>
-        <w:pStyle w:val="Heading3"/>
-      </w:pPr>
-      <w:r>
         <w:t>Comments</w:t>
       </w:r>
     </w:p>
@@ -12299,205 +12079,6 @@
         <w:t>The RapidsSE prompt recognises line and block comments.  Line comments are double forward slash //.  Blocks comments start with /* and terminate with */</w:t>
       </w:r>
     </w:p>
-    <w:p>
-      <w:pPr>
-        <w:pStyle w:val="Heading1"/>
-      </w:pPr>
-      <w:bookmarkStart w:id="43" w:name="_Toc612438"/>
-      <w:r>
-        <w:lastRenderedPageBreak/>
-        <w:t>Limitations and Restrictions</w:t>
-      </w:r>
-      <w:bookmarkEnd w:id="43"/>
-    </w:p>
-    <w:p>
-      <w:r>
-        <w:t>The following limitations and restrictions apply:</w:t>
-      </w:r>
-    </w:p>
-    <w:tbl>
-      <w:tblPr>
-        <w:tblStyle w:val="TableGrid"/>
-        <w:tblW w:w="0" w:type="auto"/>
-        <w:tblLook w:val="04A0" w:firstRow="1" w:lastRow="0" w:firstColumn="1" w:lastColumn="0" w:noHBand="0" w:noVBand="1"/>
-      </w:tblPr>
-      <w:tblGrid>
-        <w:gridCol w:w="2405"/>
-        <w:gridCol w:w="6605"/>
-      </w:tblGrid>
-      <w:tr>
-        <w:tc>
-          <w:tcPr>
-            <w:tcW w:w="2405" w:type="dxa"/>
-            <w:shd w:val="clear" w:color="auto" w:fill="D9D9D9" w:themeFill="background1" w:themeFillShade="D9"/>
-          </w:tcPr>
-          <w:p>
-            <w:pPr>
-              <w:rPr>
-                <w:b/>
-              </w:rPr>
-            </w:pPr>
-            <w:r>
-              <w:rPr>
-                <w:b/>
-              </w:rPr>
-              <w:t>Property</w:t>
-            </w:r>
-          </w:p>
-        </w:tc>
-        <w:tc>
-          <w:tcPr>
-            <w:tcW w:w="6605" w:type="dxa"/>
-            <w:shd w:val="clear" w:color="auto" w:fill="D9D9D9" w:themeFill="background1" w:themeFillShade="D9"/>
-          </w:tcPr>
-          <w:p>
-            <w:pPr>
-              <w:rPr>
-                <w:b/>
-              </w:rPr>
-            </w:pPr>
-            <w:r>
-              <w:rPr>
-                <w:b/>
-              </w:rPr>
-              <w:t>Description</w:t>
-            </w:r>
-          </w:p>
-        </w:tc>
-      </w:tr>
-      <w:tr>
-        <w:tc>
-          <w:tcPr>
-            <w:tcW w:w="2405" w:type="dxa"/>
-          </w:tcPr>
-          <w:p>
-            <w:r>
-              <w:t>Columns per table</w:t>
-            </w:r>
-          </w:p>
-        </w:tc>
-        <w:tc>
-          <w:tcPr>
-            <w:tcW w:w="6605" w:type="dxa"/>
-          </w:tcPr>
-          <w:p>
-            <w:r>
-              <w:t>Maximum of 150 columns per table</w:t>
-            </w:r>
-          </w:p>
-        </w:tc>
-      </w:tr>
-      <w:tr>
-        <w:tc>
-          <w:tcPr>
-            <w:tcW w:w="2405" w:type="dxa"/>
-          </w:tcPr>
-          <w:p>
-            <w:r>
-              <w:t>Indexes per table</w:t>
-            </w:r>
-          </w:p>
-        </w:tc>
-        <w:tc>
-          <w:tcPr>
-            <w:tcW w:w="6605" w:type="dxa"/>
-          </w:tcPr>
-          <w:p>
-            <w:r>
-              <w:t>Maximum of 1024 indexes per table</w:t>
-            </w:r>
-          </w:p>
-        </w:tc>
-      </w:tr>
-      <w:tr>
-        <w:tc>
-          <w:tcPr>
-            <w:tcW w:w="2405" w:type="dxa"/>
-          </w:tcPr>
-          <w:p>
-            <w:r>
-              <w:t>Column per index</w:t>
-            </w:r>
-          </w:p>
-        </w:tc>
-        <w:tc>
-          <w:tcPr>
-            <w:tcW w:w="6605" w:type="dxa"/>
-          </w:tcPr>
-          <w:p>
-            <w:r>
-              <w:t>Maximum of 8 columns per index</w:t>
-            </w:r>
-          </w:p>
-        </w:tc>
-      </w:tr>
-      <w:tr>
-        <w:tc>
-          <w:tcPr>
-            <w:tcW w:w="2405" w:type="dxa"/>
-          </w:tcPr>
-          <w:p>
-            <w:r>
-              <w:t>Names</w:t>
-            </w:r>
-          </w:p>
-        </w:tc>
-        <w:tc>
-          <w:tcPr>
-            <w:tcW w:w="6605" w:type="dxa"/>
-          </w:tcPr>
-          <w:p>
-            <w:r>
-              <w:t>Maximum of 30 characters for table names, column names and index names.</w:t>
-            </w:r>
-          </w:p>
-        </w:tc>
-      </w:tr>
-      <w:tr>
-        <w:tc>
-          <w:tcPr>
-            <w:tcW w:w="2405" w:type="dxa"/>
-          </w:tcPr>
-          <w:p>
-            <w:r>
-              <w:t>Row size</w:t>
-            </w:r>
-          </w:p>
-        </w:tc>
-        <w:tc>
-          <w:tcPr>
-            <w:tcW w:w="6605" w:type="dxa"/>
-          </w:tcPr>
-          <w:p>
-            <w:r>
-              <w:t>Maximum of 4KB per row</w:t>
-            </w:r>
-          </w:p>
-        </w:tc>
-      </w:tr>
-      <w:tr>
-        <w:tc>
-          <w:tcPr>
-            <w:tcW w:w="2405" w:type="dxa"/>
-          </w:tcPr>
-          <w:p>
-            <w:r>
-              <w:t>CSV record size</w:t>
-            </w:r>
-          </w:p>
-        </w:tc>
-        <w:tc>
-          <w:tcPr>
-            <w:tcW w:w="6605" w:type="dxa"/>
-          </w:tcPr>
-          <w:p>
-            <w:r>
-              <w:t>Maximum of 16KB per record</w:t>
-            </w:r>
-          </w:p>
-        </w:tc>
-      </w:tr>
-    </w:tbl>
     <w:p>
       <w:pPr>
         <w:spacing w:after="0"/>
@@ -12518,12 +12099,12 @@
       <w:pPr>
         <w:pStyle w:val="Heading1"/>
       </w:pPr>
-      <w:bookmarkStart w:id="44" w:name="_Toc612439"/>
+      <w:bookmarkStart w:id="42" w:name="_Toc614954"/>
       <w:r>
         <w:lastRenderedPageBreak/>
         <w:t>Fetching Rows Using Indexes</w:t>
       </w:r>
-      <w:bookmarkEnd w:id="44"/>
+      <w:bookmarkEnd w:id="42"/>
     </w:p>
     <w:p>
       <w:r>
@@ -12532,16 +12113,7 @@
     </w:p>
     <w:p>
       <w:r>
-        <w:t xml:space="preserve">By way of </w:t>
-      </w:r>
-      <w:r>
-        <w:t xml:space="preserve">first </w:t>
-      </w:r>
-      <w:r>
-        <w:t xml:space="preserve">example let’s retrieve </w:t>
-      </w:r>
-      <w:r>
-        <w:t>a row using an exact key match:</w:t>
+        <w:t>By way of first example let’s retrieve a row using an exact key match:</w:t>
       </w:r>
     </w:p>
     <w:p>
@@ -13300,7 +12872,7 @@
     </w:p>
     <w:p>
       <w:pPr>
-        <w:pStyle w:val="Heading4"/>
+        <w:pStyle w:val="Heading2"/>
       </w:pPr>
       <w:r>
         <w:t>Notes on the RPN Notation</w:t>
@@ -13316,12 +12888,7 @@
         <w:pStyle w:val="SePrompt"/>
       </w:pPr>
       <w:r>
-        <w:t>f</w:t>
-      </w:r>
-      <w:bookmarkStart w:id="45" w:name="_GoBack"/>
-      <w:bookmarkEnd w:id="45"/>
-      <w:r>
-        <w:t>etch &lt;</w:t>
+        <w:t>fetch &lt;</w:t>
       </w:r>
       <w:proofErr w:type="spellStart"/>
       <w:r>
@@ -13349,12 +12916,12 @@
       <w:pPr>
         <w:pStyle w:val="Heading1"/>
       </w:pPr>
-      <w:bookmarkStart w:id="46" w:name="_Toc612440"/>
+      <w:bookmarkStart w:id="43" w:name="_Toc614955"/>
       <w:r>
         <w:lastRenderedPageBreak/>
         <w:t>Appendix A – Command Line Arguments</w:t>
       </w:r>
-      <w:bookmarkEnd w:id="46"/>
+      <w:bookmarkEnd w:id="43"/>
     </w:p>
     <w:p/>
     <w:tbl>
@@ -13712,8 +13279,6 @@
         </w:tc>
       </w:tr>
     </w:tbl>
-    <w:p/>
-    <w:p/>
     <w:p>
       <w:pPr>
         <w:rPr>
@@ -13723,20 +13288,16 @@
           <w:szCs w:val="32"/>
         </w:rPr>
       </w:pPr>
-      <w:r>
-        <w:br w:type="page"/>
-      </w:r>
     </w:p>
     <w:p>
       <w:pPr>
         <w:pStyle w:val="Heading1"/>
       </w:pPr>
-      <w:bookmarkStart w:id="47" w:name="_Toc612441"/>
-      <w:r>
-        <w:lastRenderedPageBreak/>
+      <w:bookmarkStart w:id="44" w:name="_Toc614956"/>
+      <w:r>
         <w:t>Appendix B – Prompt Functions</w:t>
       </w:r>
-      <w:bookmarkEnd w:id="47"/>
+      <w:bookmarkEnd w:id="44"/>
     </w:p>
     <w:p>
       <w:r>
@@ -14137,13 +13698,465 @@
       <w:pPr>
         <w:pStyle w:val="Heading1"/>
       </w:pPr>
-      <w:bookmarkStart w:id="48" w:name="_Toc612442"/>
+      <w:bookmarkStart w:id="45" w:name="_Toc614957"/>
       <w:r>
         <w:lastRenderedPageBreak/>
+        <w:t>Appendix C – Supported Column Types</w:t>
+      </w:r>
+      <w:bookmarkEnd w:id="45"/>
+    </w:p>
+    <w:p>
+      <w:r>
+        <w:t>RapidsSE supports the following column data types.</w:t>
+      </w:r>
+    </w:p>
+    <w:p/>
+    <w:tbl>
+      <w:tblPr>
+        <w:tblStyle w:val="TableGrid"/>
+        <w:tblW w:w="0" w:type="auto"/>
+        <w:tblLook w:val="04A0" w:firstRow="1" w:lastRow="0" w:firstColumn="1" w:lastColumn="0" w:noHBand="0" w:noVBand="1"/>
+      </w:tblPr>
+      <w:tblGrid>
+        <w:gridCol w:w="2263"/>
+        <w:gridCol w:w="6747"/>
+      </w:tblGrid>
+      <w:tr>
+        <w:tc>
+          <w:tcPr>
+            <w:tcW w:w="2263" w:type="dxa"/>
+            <w:shd w:val="clear" w:color="auto" w:fill="D9D9D9" w:themeFill="background1" w:themeFillShade="D9"/>
+          </w:tcPr>
+          <w:p>
+            <w:r>
+              <w:t>Column Type</w:t>
+            </w:r>
+          </w:p>
+        </w:tc>
+        <w:tc>
+          <w:tcPr>
+            <w:tcW w:w="6747" w:type="dxa"/>
+            <w:shd w:val="clear" w:color="auto" w:fill="D9D9D9" w:themeFill="background1" w:themeFillShade="D9"/>
+          </w:tcPr>
+          <w:p>
+            <w:r>
+              <w:t>Description</w:t>
+            </w:r>
+          </w:p>
+        </w:tc>
+      </w:tr>
+      <w:tr>
+        <w:tc>
+          <w:tcPr>
+            <w:tcW w:w="2263" w:type="dxa"/>
+          </w:tcPr>
+          <w:p>
+            <w:proofErr w:type="spellStart"/>
+            <w:r>
+              <w:t>boolean</w:t>
+            </w:r>
+            <w:proofErr w:type="spellEnd"/>
+          </w:p>
+        </w:tc>
+        <w:tc>
+          <w:tcPr>
+            <w:tcW w:w="6747" w:type="dxa"/>
+          </w:tcPr>
+          <w:p>
+            <w:r>
+              <w:t>Standard Boolean values: true or false</w:t>
+            </w:r>
+          </w:p>
+        </w:tc>
+      </w:tr>
+      <w:tr>
+        <w:tc>
+          <w:tcPr>
+            <w:tcW w:w="2263" w:type="dxa"/>
+          </w:tcPr>
+          <w:p>
+            <w:r>
+              <w:t>date</w:t>
+            </w:r>
+          </w:p>
+        </w:tc>
+        <w:tc>
+          <w:tcPr>
+            <w:tcW w:w="6747" w:type="dxa"/>
+          </w:tcPr>
+          <w:p>
+            <w:r>
+              <w:t>Date values (year, month, day)</w:t>
+            </w:r>
+          </w:p>
+        </w:tc>
+      </w:tr>
+      <w:tr>
+        <w:tc>
+          <w:tcPr>
+            <w:tcW w:w="2263" w:type="dxa"/>
+          </w:tcPr>
+          <w:p>
+            <w:r>
+              <w:t>decimal</w:t>
+            </w:r>
+          </w:p>
+        </w:tc>
+        <w:tc>
+          <w:tcPr>
+            <w:tcW w:w="6747" w:type="dxa"/>
+          </w:tcPr>
+          <w:p>
+            <w:r>
+              <w:t>Decimal values up to 19 digits</w:t>
+            </w:r>
+          </w:p>
+        </w:tc>
+      </w:tr>
+      <w:tr>
+        <w:tc>
+          <w:tcPr>
+            <w:tcW w:w="2263" w:type="dxa"/>
+          </w:tcPr>
+          <w:p>
+            <w:r>
+              <w:t>float</w:t>
+            </w:r>
+          </w:p>
+        </w:tc>
+        <w:tc>
+          <w:tcPr>
+            <w:tcW w:w="6747" w:type="dxa"/>
+          </w:tcPr>
+          <w:p>
+            <w:r>
+              <w:t>8-byte floating point values</w:t>
+            </w:r>
+          </w:p>
+        </w:tc>
+      </w:tr>
+      <w:tr>
+        <w:tc>
+          <w:tcPr>
+            <w:tcW w:w="2263" w:type="dxa"/>
+          </w:tcPr>
+          <w:p>
+            <w:r>
+              <w:t>integer</w:t>
+            </w:r>
+          </w:p>
+        </w:tc>
+        <w:tc>
+          <w:tcPr>
+            <w:tcW w:w="6747" w:type="dxa"/>
+          </w:tcPr>
+          <w:p>
+            <w:r>
+              <w:t>8-byte integer values</w:t>
+            </w:r>
+          </w:p>
+        </w:tc>
+      </w:tr>
+      <w:tr>
+        <w:tc>
+          <w:tcPr>
+            <w:tcW w:w="2263" w:type="dxa"/>
+          </w:tcPr>
+          <w:p>
+            <w:r>
+              <w:t>interval</w:t>
+            </w:r>
+          </w:p>
+        </w:tc>
+        <w:tc>
+          <w:tcPr>
+            <w:tcW w:w="6747" w:type="dxa"/>
+          </w:tcPr>
+          <w:p>
+            <w:r>
+              <w:t xml:space="preserve">Second and microsecond intervals </w:t>
+            </w:r>
+          </w:p>
+        </w:tc>
+      </w:tr>
+      <w:tr>
+        <w:tc>
+          <w:tcPr>
+            <w:tcW w:w="2263" w:type="dxa"/>
+          </w:tcPr>
+          <w:p>
+            <w:r>
+              <w:t>time</w:t>
+            </w:r>
+          </w:p>
+        </w:tc>
+        <w:tc>
+          <w:tcPr>
+            <w:tcW w:w="6747" w:type="dxa"/>
+          </w:tcPr>
+          <w:p>
+            <w:r>
+              <w:t>Time values (hour, minute, second, microseconds)</w:t>
+            </w:r>
+          </w:p>
+        </w:tc>
+      </w:tr>
+      <w:tr>
+        <w:tc>
+          <w:tcPr>
+            <w:tcW w:w="2263" w:type="dxa"/>
+          </w:tcPr>
+          <w:p>
+            <w:r>
+              <w:t>timestamp</w:t>
+            </w:r>
+          </w:p>
+        </w:tc>
+        <w:tc>
+          <w:tcPr>
+            <w:tcW w:w="6747" w:type="dxa"/>
+          </w:tcPr>
+          <w:p>
+            <w:r>
+              <w:t>Combined date and time values</w:t>
+            </w:r>
+          </w:p>
+        </w:tc>
+      </w:tr>
+      <w:tr>
+        <w:tc>
+          <w:tcPr>
+            <w:tcW w:w="2263" w:type="dxa"/>
+          </w:tcPr>
+          <w:p>
+            <w:r>
+              <w:t>varchar</w:t>
+            </w:r>
+          </w:p>
+        </w:tc>
+        <w:tc>
+          <w:tcPr>
+            <w:tcW w:w="6747" w:type="dxa"/>
+          </w:tcPr>
+          <w:p>
+            <w:r>
+              <w:t>Variable length character strings</w:t>
+            </w:r>
+            <w:bookmarkStart w:id="46" w:name="_GoBack"/>
+            <w:bookmarkEnd w:id="46"/>
+          </w:p>
+        </w:tc>
+      </w:tr>
+    </w:tbl>
+    <w:p/>
+    <w:p>
+      <w:pPr>
+        <w:pStyle w:val="Heading1"/>
+      </w:pPr>
+      <w:bookmarkStart w:id="47" w:name="_Toc614958"/>
+      <w:r>
+        <w:t>Appendix D – Limitations and Restrictions</w:t>
+      </w:r>
+      <w:bookmarkEnd w:id="47"/>
+    </w:p>
+    <w:p>
+      <w:r>
+        <w:t>The following limitations and restrictions apply:</w:t>
+      </w:r>
+    </w:p>
+    <w:tbl>
+      <w:tblPr>
+        <w:tblStyle w:val="TableGrid"/>
+        <w:tblW w:w="0" w:type="auto"/>
+        <w:tblLook w:val="04A0" w:firstRow="1" w:lastRow="0" w:firstColumn="1" w:lastColumn="0" w:noHBand="0" w:noVBand="1"/>
+      </w:tblPr>
+      <w:tblGrid>
+        <w:gridCol w:w="2405"/>
+        <w:gridCol w:w="6605"/>
+      </w:tblGrid>
+      <w:tr>
+        <w:tc>
+          <w:tcPr>
+            <w:tcW w:w="2405" w:type="dxa"/>
+            <w:shd w:val="clear" w:color="auto" w:fill="D9D9D9" w:themeFill="background1" w:themeFillShade="D9"/>
+          </w:tcPr>
+          <w:p>
+            <w:pPr>
+              <w:rPr>
+                <w:b/>
+              </w:rPr>
+            </w:pPr>
+            <w:r>
+              <w:rPr>
+                <w:b/>
+              </w:rPr>
+              <w:t>Property</w:t>
+            </w:r>
+          </w:p>
+        </w:tc>
+        <w:tc>
+          <w:tcPr>
+            <w:tcW w:w="6605" w:type="dxa"/>
+            <w:shd w:val="clear" w:color="auto" w:fill="D9D9D9" w:themeFill="background1" w:themeFillShade="D9"/>
+          </w:tcPr>
+          <w:p>
+            <w:pPr>
+              <w:rPr>
+                <w:b/>
+              </w:rPr>
+            </w:pPr>
+            <w:r>
+              <w:rPr>
+                <w:b/>
+              </w:rPr>
+              <w:t>Description</w:t>
+            </w:r>
+          </w:p>
+        </w:tc>
+      </w:tr>
+      <w:tr>
+        <w:tc>
+          <w:tcPr>
+            <w:tcW w:w="2405" w:type="dxa"/>
+          </w:tcPr>
+          <w:p>
+            <w:r>
+              <w:t>Columns per table</w:t>
+            </w:r>
+          </w:p>
+        </w:tc>
+        <w:tc>
+          <w:tcPr>
+            <w:tcW w:w="6605" w:type="dxa"/>
+          </w:tcPr>
+          <w:p>
+            <w:r>
+              <w:t>Maximum of 150 columns per table</w:t>
+            </w:r>
+          </w:p>
+        </w:tc>
+      </w:tr>
+      <w:tr>
+        <w:tc>
+          <w:tcPr>
+            <w:tcW w:w="2405" w:type="dxa"/>
+          </w:tcPr>
+          <w:p>
+            <w:r>
+              <w:t>Indexes per table</w:t>
+            </w:r>
+          </w:p>
+        </w:tc>
+        <w:tc>
+          <w:tcPr>
+            <w:tcW w:w="6605" w:type="dxa"/>
+          </w:tcPr>
+          <w:p>
+            <w:r>
+              <w:t>Maximum of 1024 indexes per table</w:t>
+            </w:r>
+          </w:p>
+        </w:tc>
+      </w:tr>
+      <w:tr>
+        <w:tc>
+          <w:tcPr>
+            <w:tcW w:w="2405" w:type="dxa"/>
+          </w:tcPr>
+          <w:p>
+            <w:r>
+              <w:t>Column per index</w:t>
+            </w:r>
+          </w:p>
+        </w:tc>
+        <w:tc>
+          <w:tcPr>
+            <w:tcW w:w="6605" w:type="dxa"/>
+          </w:tcPr>
+          <w:p>
+            <w:r>
+              <w:t>Maximum of 8 columns per index</w:t>
+            </w:r>
+          </w:p>
+        </w:tc>
+      </w:tr>
+      <w:tr>
+        <w:tc>
+          <w:tcPr>
+            <w:tcW w:w="2405" w:type="dxa"/>
+          </w:tcPr>
+          <w:p>
+            <w:r>
+              <w:t>Names</w:t>
+            </w:r>
+          </w:p>
+        </w:tc>
+        <w:tc>
+          <w:tcPr>
+            <w:tcW w:w="6605" w:type="dxa"/>
+          </w:tcPr>
+          <w:p>
+            <w:r>
+              <w:t>Maximum of 30 characters for table names, column names and index names.</w:t>
+            </w:r>
+          </w:p>
+        </w:tc>
+      </w:tr>
+      <w:tr>
+        <w:tc>
+          <w:tcPr>
+            <w:tcW w:w="2405" w:type="dxa"/>
+          </w:tcPr>
+          <w:p>
+            <w:r>
+              <w:t>Row size</w:t>
+            </w:r>
+          </w:p>
+        </w:tc>
+        <w:tc>
+          <w:tcPr>
+            <w:tcW w:w="6605" w:type="dxa"/>
+          </w:tcPr>
+          <w:p>
+            <w:r>
+              <w:t>Maximum of 4KB per row</w:t>
+            </w:r>
+          </w:p>
+        </w:tc>
+      </w:tr>
+      <w:tr>
+        <w:tc>
+          <w:tcPr>
+            <w:tcW w:w="2405" w:type="dxa"/>
+          </w:tcPr>
+          <w:p>
+            <w:r>
+              <w:t>CSV record size</w:t>
+            </w:r>
+          </w:p>
+        </w:tc>
+        <w:tc>
+          <w:tcPr>
+            <w:tcW w:w="6605" w:type="dxa"/>
+          </w:tcPr>
+          <w:p>
+            <w:r>
+              <w:t>Maximum of 16KB per record</w:t>
+            </w:r>
+          </w:p>
+        </w:tc>
+      </w:tr>
+    </w:tbl>
+    <w:p>
+      <w:pPr>
+        <w:pStyle w:val="Heading1"/>
+      </w:pPr>
+      <w:bookmarkStart w:id="48" w:name="_Toc614959"/>
+      <w:r>
         <w:t xml:space="preserve">Appendix </w:t>
       </w:r>
       <w:r>
-        <w:t>C</w:t>
+        <w:t>E</w:t>
       </w:r>
       <w:r>
         <w:t xml:space="preserve"> – </w:t>
@@ -14154,6 +14167,7 @@
       <w:r>
         <w:t>Test Harness</w:t>
       </w:r>
+      <w:bookmarkEnd w:id="48"/>
     </w:p>
     <w:p>
       <w:r>
@@ -14188,12 +14202,13 @@
       <w:pPr>
         <w:pStyle w:val="Heading1"/>
       </w:pPr>
+      <w:bookmarkStart w:id="49" w:name="_Toc614960"/>
       <w:r>
         <w:lastRenderedPageBreak/>
         <w:t xml:space="preserve">Appendix </w:t>
       </w:r>
       <w:r>
-        <w:t>D</w:t>
+        <w:t>F</w:t>
       </w:r>
       <w:r>
         <w:t xml:space="preserve"> – </w:t>
@@ -14207,7 +14222,7 @@
       <w:r>
         <w:t>s</w:t>
       </w:r>
-      <w:bookmarkEnd w:id="48"/>
+      <w:bookmarkEnd w:id="49"/>
     </w:p>
     <w:p/>
     <w:tbl>
@@ -16703,7 +16718,7 @@
 </file>
 
 <file path=customXml/itemProps1.xml><?xml version="1.0" encoding="utf-8"?>
-<ds:datastoreItem xmlns:ds="http://schemas.openxmlformats.org/officeDocument/2006/customXml" ds:itemID="{EDFDDEC1-8B9C-AC42-9C1D-70825C4D2AEA}">
+<ds:datastoreItem xmlns:ds="http://schemas.openxmlformats.org/officeDocument/2006/customXml" ds:itemID="{CD1EF715-091D-6E49-AB6D-5BD9093C705F}">
   <ds:schemaRefs>
     <ds:schemaRef ds:uri="http://schemas.openxmlformats.org/officeDocument/2006/bibliography"/>
   </ds:schemaRefs>

</xml_diff>